<commit_message>
Dry pretty much done
</commit_message>
<xml_diff>
--- a/HW3_WET/ML Major 3.docx
+++ b/HW3_WET/ML Major 3.docx
@@ -211,7 +211,7 @@
                     <pic:cNvPicPr/>
                   </pic:nvPicPr>
                   <pic:blipFill>
-                    <a:blip r:embed="rId5"/>
+                    <a:blip r:embed="rId6"/>
                     <a:stretch>
                       <a:fillRect/>
                     </a:stretch>
@@ -1060,7 +1060,7 @@
                     <pic:cNvPicPr/>
                   </pic:nvPicPr>
                   <pic:blipFill>
-                    <a:blip r:embed="rId6"/>
+                    <a:blip r:embed="rId7"/>
                     <a:stretch>
                       <a:fillRect/>
                     </a:stretch>
@@ -1116,7 +1116,7 @@
                     <pic:cNvPicPr/>
                   </pic:nvPicPr>
                   <pic:blipFill>
-                    <a:blip r:embed="rId7"/>
+                    <a:blip r:embed="rId8"/>
                     <a:stretch>
                       <a:fillRect/>
                     </a:stretch>
@@ -1157,7 +1157,7 @@
         </w:rPr>
         <w:lastRenderedPageBreak/>
         <w:drawing>
-          <wp:anchor distT="0" distB="0" distL="114300" distR="114300" simplePos="0" relativeHeight="251658240" behindDoc="0" locked="0" layoutInCell="1" allowOverlap="1" wp14:anchorId="2039C517" wp14:editId="009E8D1F">
+          <wp:anchor distT="0" distB="0" distL="114300" distR="114300" simplePos="0" relativeHeight="251658240" behindDoc="0" locked="0" layoutInCell="1" allowOverlap="1" wp14:anchorId="2039C517" wp14:editId="459EA16A">
             <wp:simplePos x="0" y="0"/>
             <wp:positionH relativeFrom="column">
               <wp:posOffset>-452755</wp:posOffset>
@@ -1180,7 +1180,7 @@
                     <pic:cNvPicPr/>
                   </pic:nvPicPr>
                   <pic:blipFill>
-                    <a:blip r:embed="rId8" cstate="print">
+                    <a:blip r:embed="rId9" cstate="print">
                       <a:extLst>
                         <a:ext uri="{28A0092B-C50C-407E-A947-70E740481C1C}">
                           <a14:useLocalDpi xmlns:a14="http://schemas.microsoft.com/office/drawing/2010/main" val="0"/>
@@ -1233,7 +1233,7 @@
                     <pic:cNvPicPr/>
                   </pic:nvPicPr>
                   <pic:blipFill>
-                    <a:blip r:embed="rId9"/>
+                    <a:blip r:embed="rId10"/>
                     <a:stretch>
                       <a:fillRect/>
                     </a:stretch>
@@ -1297,7 +1297,7 @@
                     <pic:cNvPicPr/>
                   </pic:nvPicPr>
                   <pic:blipFill>
-                    <a:blip r:embed="rId10"/>
+                    <a:blip r:embed="rId11"/>
                     <a:stretch>
                       <a:fillRect/>
                     </a:stretch>
@@ -1526,7 +1526,7 @@
                     <pic:cNvPicPr/>
                   </pic:nvPicPr>
                   <pic:blipFill>
-                    <a:blip r:embed="rId11"/>
+                    <a:blip r:embed="rId12"/>
                     <a:stretch>
                       <a:fillRect/>
                     </a:stretch>
@@ -1838,7 +1838,7 @@
                     <pic:cNvPicPr/>
                   </pic:nvPicPr>
                   <pic:blipFill>
-                    <a:blip r:embed="rId12"/>
+                    <a:blip r:embed="rId13"/>
                     <a:stretch>
                       <a:fillRect/>
                     </a:stretch>
@@ -1887,7 +1887,7 @@
                     <pic:cNvPicPr/>
                   </pic:nvPicPr>
                   <pic:blipFill>
-                    <a:blip r:embed="rId13"/>
+                    <a:blip r:embed="rId14"/>
                     <a:stretch>
                       <a:fillRect/>
                     </a:stretch>
@@ -1935,7 +1935,7 @@
                     <pic:cNvPicPr/>
                   </pic:nvPicPr>
                   <pic:blipFill>
-                    <a:blip r:embed="rId14"/>
+                    <a:blip r:embed="rId15"/>
                     <a:stretch>
                       <a:fillRect/>
                     </a:stretch>
@@ -2356,7 +2356,7 @@
                     <pic:cNvPicPr/>
                   </pic:nvPicPr>
                   <pic:blipFill>
-                    <a:blip r:embed="rId15"/>
+                    <a:blip r:embed="rId16"/>
                     <a:stretch>
                       <a:fillRect/>
                     </a:stretch>
@@ -2566,7 +2566,7 @@
                     <pic:cNvPicPr/>
                   </pic:nvPicPr>
                   <pic:blipFill>
-                    <a:blip r:embed="rId16"/>
+                    <a:blip r:embed="rId17"/>
                     <a:stretch>
                       <a:fillRect/>
                     </a:stretch>
@@ -2614,7 +2614,7 @@
                     <pic:cNvPicPr/>
                   </pic:nvPicPr>
                   <pic:blipFill>
-                    <a:blip r:embed="rId17"/>
+                    <a:blip r:embed="rId18"/>
                     <a:stretch>
                       <a:fillRect/>
                     </a:stretch>
@@ -2662,7 +2662,7 @@
                     <pic:cNvPicPr/>
                   </pic:nvPicPr>
                   <pic:blipFill>
-                    <a:blip r:embed="rId18"/>
+                    <a:blip r:embed="rId19"/>
                     <a:stretch>
                       <a:fillRect/>
                     </a:stretch>
@@ -2718,7 +2718,7 @@
                     <pic:cNvPicPr/>
                   </pic:nvPicPr>
                   <pic:blipFill>
-                    <a:blip r:embed="rId19"/>
+                    <a:blip r:embed="rId20"/>
                     <a:stretch>
                       <a:fillRect/>
                     </a:stretch>
@@ -3208,7 +3208,7 @@
                     <pic:cNvPicPr/>
                   </pic:nvPicPr>
                   <pic:blipFill>
-                    <a:blip r:embed="rId20"/>
+                    <a:blip r:embed="rId21"/>
                     <a:stretch>
                       <a:fillRect/>
                     </a:stretch>
@@ -3383,7 +3383,7 @@
                     <pic:cNvPicPr/>
                   </pic:nvPicPr>
                   <pic:blipFill>
-                    <a:blip r:embed="rId21"/>
+                    <a:blip r:embed="rId22"/>
                     <a:stretch>
                       <a:fillRect/>
                     </a:stretch>
@@ -3431,7 +3431,7 @@
                     <pic:cNvPicPr/>
                   </pic:nvPicPr>
                   <pic:blipFill>
-                    <a:blip r:embed="rId22"/>
+                    <a:blip r:embed="rId23"/>
                     <a:stretch>
                       <a:fillRect/>
                     </a:stretch>
@@ -3480,7 +3480,7 @@
                     <pic:cNvPicPr/>
                   </pic:nvPicPr>
                   <pic:blipFill>
-                    <a:blip r:embed="rId23"/>
+                    <a:blip r:embed="rId24"/>
                     <a:stretch>
                       <a:fillRect/>
                     </a:stretch>
@@ -3617,7 +3617,7 @@
                     <pic:cNvPicPr/>
                   </pic:nvPicPr>
                   <pic:blipFill>
-                    <a:blip r:embed="rId24"/>
+                    <a:blip r:embed="rId25"/>
                     <a:stretch>
                       <a:fillRect/>
                     </a:stretch>
@@ -3650,207 +3650,239 @@
           <w:color w:val="156082" w:themeColor="accent1"/>
           <w:lang w:val="en-US"/>
         </w:rPr>
-        <w:t xml:space="preserve">If the features are not normalized, they have different scales. </w:t>
-      </w:r>
-    </w:p>
-    <w:p>
-      <w:pPr>
-        <w:rPr>
-          <w:color w:val="156082" w:themeColor="accent1"/>
-          <w:lang w:val="en-US"/>
-        </w:rPr>
-      </w:pPr>
-      <w:r>
-        <w:rPr>
-          <w:color w:val="156082" w:themeColor="accent1"/>
-          <w:lang w:val="en-US"/>
-        </w:rPr>
-        <w:t xml:space="preserve">Because </w:t>
-      </w:r>
-      <w:r>
-        <w:rPr>
-          <w:color w:val="156082" w:themeColor="accent1"/>
-          <w:lang w:val="en-US"/>
+        <w:t xml:space="preserve">If the features are not normalized, they </w:t>
+      </w:r>
+      <w:r>
+        <w:rPr>
+          <w:color w:val="156082" w:themeColor="accent1"/>
+          <w:lang w:val="en-US"/>
+        </w:rPr>
+        <w:t xml:space="preserve">may </w:t>
+      </w:r>
+      <w:r>
+        <w:rPr>
+          <w:color w:val="156082" w:themeColor="accent1"/>
+          <w:lang w:val="en-US"/>
+        </w:rPr>
+        <w:t xml:space="preserve">have different scales. </w:t>
+      </w:r>
+    </w:p>
+    <w:p>
+      <w:pPr>
+        <w:rPr>
+          <w:color w:val="156082" w:themeColor="accent1"/>
+        </w:rPr>
+      </w:pPr>
+      <w:r>
+        <w:rPr>
+          <w:color w:val="156082" w:themeColor="accent1"/>
+        </w:rPr>
+        <w:t>W</w:t>
+      </w:r>
+      <w:r>
+        <w:rPr>
+          <w:color w:val="156082" w:themeColor="accent1"/>
+        </w:rPr>
+        <w:t>ith</w:t>
+      </w:r>
+      <w:r>
+        <w:rPr>
+          <w:color w:val="156082" w:themeColor="accent1"/>
+        </w:rPr>
+        <w:t xml:space="preserve"> </w:t>
+      </w:r>
+      <w:r>
+        <w:rPr>
+          <w:color w:val="156082" w:themeColor="accent1"/>
+        </w:rPr>
+        <w:t>non-</w:t>
+      </w:r>
+      <w:r>
+        <w:rPr>
+          <w:color w:val="156082" w:themeColor="accent1"/>
+        </w:rPr>
+        <w:t>normalized</w:t>
+      </w:r>
+      <w:r>
+        <w:rPr>
+          <w:color w:val="156082" w:themeColor="accent1"/>
+        </w:rPr>
+        <w:t xml:space="preserve"> </w:t>
+      </w:r>
+      <w:r>
+        <w:rPr>
+          <w:color w:val="156082" w:themeColor="accent1"/>
+        </w:rPr>
+        <w:t>features</w:t>
+      </w:r>
+      <w:r>
+        <w:rPr>
+          <w:color w:val="156082" w:themeColor="accent1"/>
+        </w:rPr>
+        <w:t>, s</w:t>
+      </w:r>
+      <w:r>
+        <w:rPr>
+          <w:color w:val="156082" w:themeColor="accent1"/>
+        </w:rPr>
+        <w:t xml:space="preserve">ince λ is applied equally to all coefficients, the scale of features affects </w:t>
+      </w:r>
+      <w:r>
+        <w:rPr>
+          <w:color w:val="156082" w:themeColor="accent1"/>
         </w:rPr>
         <w:t xml:space="preserve">the </w:t>
       </w:r>
-      <m:oMath>
-        <m:r>
-          <w:rPr>
-            <w:rFonts w:ascii="Cambria Math" w:hAnsi="Cambria Math"/>
-            <w:color w:val="156082" w:themeColor="accent1"/>
-            <w:lang w:val="en-US"/>
-          </w:rPr>
-          <m:t xml:space="preserve">λ </m:t>
-        </m:r>
-      </m:oMath>
-      <w:r>
-        <w:rPr>
-          <w:rFonts w:eastAsiaTheme="minorEastAsia"/>
-          <w:color w:val="156082" w:themeColor="accent1"/>
-          <w:lang w:val="en-US"/>
-        </w:rPr>
-        <w:t xml:space="preserve"> of the Lasso model is </w:t>
-      </w:r>
-      <w:proofErr w:type="spellStart"/>
+      <w:r>
+        <w:rPr>
+          <w:color w:val="156082" w:themeColor="accent1"/>
+        </w:rPr>
+        <w:t xml:space="preserve">Lasso </w:t>
+      </w:r>
+      <w:r>
+        <w:rPr>
+          <w:color w:val="156082" w:themeColor="accent1"/>
+        </w:rPr>
+        <w:t xml:space="preserve">l1 </w:t>
+      </w:r>
+      <w:r>
+        <w:rPr>
+          <w:color w:val="156082" w:themeColor="accent1"/>
+        </w:rPr>
+        <w:t xml:space="preserve">regularization. </w:t>
+      </w:r>
+    </w:p>
+    <w:p>
+      <w:pPr>
+        <w:rPr>
+          <w:color w:val="156082" w:themeColor="accent1"/>
+        </w:rPr>
+      </w:pPr>
+      <w:r>
+        <w:rPr>
+          <w:color w:val="156082" w:themeColor="accent1"/>
+        </w:rPr>
+        <w:t xml:space="preserve">Larger, less important variables might not have their coefficients reduced to zero due to their scale, while more important </w:t>
+      </w:r>
       <w:proofErr w:type="gramStart"/>
       <w:r>
         <w:rPr>
-          <w:rFonts w:eastAsiaTheme="minorEastAsia"/>
-          <w:color w:val="156082" w:themeColor="accent1"/>
-          <w:lang w:val="en-US"/>
-        </w:rPr>
-        <w:t>constant,</w:t>
-      </w:r>
-      <w:r>
-        <w:rPr>
-          <w:color w:val="156082" w:themeColor="accent1"/>
-          <w:lang w:val="en-US"/>
-        </w:rPr>
-        <w:t>it</w:t>
-      </w:r>
-      <w:proofErr w:type="spellEnd"/>
+          <w:color w:val="156082" w:themeColor="accent1"/>
+        </w:rPr>
+        <w:t>small</w:t>
+      </w:r>
+      <w:r>
+        <w:rPr>
+          <w:color w:val="156082" w:themeColor="accent1"/>
+        </w:rPr>
+        <w:t xml:space="preserve"> </w:t>
+      </w:r>
+      <w:r>
+        <w:rPr>
+          <w:color w:val="156082" w:themeColor="accent1"/>
+        </w:rPr>
+        <w:t>scale</w:t>
+      </w:r>
       <w:proofErr w:type="gramEnd"/>
       <w:r>
         <w:rPr>
           <w:color w:val="156082" w:themeColor="accent1"/>
-          <w:lang w:val="en-US"/>
-        </w:rPr>
-        <w:t xml:space="preserve"> affects all coefficients equally, the scale of the features can impact the regularization process.</w:t>
-      </w:r>
-      <w:r>
-        <w:rPr>
-          <w:color w:val="156082" w:themeColor="accent1"/>
-          <w:lang w:val="en-US"/>
+        </w:rPr>
+        <w:t xml:space="preserve"> features might be </w:t>
+      </w:r>
+      <w:r>
+        <w:rPr>
+          <w:color w:val="156082" w:themeColor="accent1"/>
+        </w:rPr>
+        <w:t>shrunk with zero coefficients</w:t>
+      </w:r>
+      <w:r>
+        <w:rPr>
+          <w:color w:val="156082" w:themeColor="accent1"/>
+        </w:rPr>
+        <w:t xml:space="preserve">. </w:t>
+      </w:r>
+    </w:p>
+    <w:p>
+      <w:pPr>
+        <w:rPr>
+          <w:lang w:val="en-US"/>
+        </w:rPr>
+      </w:pPr>
+      <w:r>
+        <w:rPr>
+          <w:color w:val="156082" w:themeColor="accent1"/>
+        </w:rPr>
+        <w:t xml:space="preserve">This </w:t>
+      </w:r>
+      <w:r>
+        <w:rPr>
+          <w:color w:val="156082" w:themeColor="accent1"/>
+        </w:rPr>
+        <w:t xml:space="preserve">may </w:t>
+      </w:r>
+      <w:r>
+        <w:rPr>
+          <w:color w:val="156082" w:themeColor="accent1"/>
+        </w:rPr>
+        <w:t>happen</w:t>
+      </w:r>
+      <w:r>
+        <w:rPr>
+          <w:color w:val="156082" w:themeColor="accent1"/>
         </w:rPr>
         <w:t xml:space="preserve"> </w:t>
       </w:r>
-    </w:p>
-    <w:p>
-      <w:pPr>
-        <w:rPr>
-          <w:color w:val="156082" w:themeColor="accent1"/>
-          <w:lang w:val="en-US"/>
-        </w:rPr>
-      </w:pPr>
-      <w:r>
-        <w:rPr>
-          <w:color w:val="156082" w:themeColor="accent1"/>
-          <w:lang w:val="en-US"/>
-        </w:rPr>
-        <w:t>Meaning i</w:t>
-      </w:r>
-      <w:r>
-        <w:rPr>
-          <w:color w:val="156082" w:themeColor="accent1"/>
-          <w:lang w:val="en-US"/>
-        </w:rPr>
-        <w:t xml:space="preserve">n the not normalized case, the Lasso may lead features with larger scales to have coefficients that are penalized less relative to their actual scale. This may lead to a situation where the model doesn’t effectively </w:t>
+      <w:r>
+        <w:rPr>
+          <w:color w:val="156082" w:themeColor="accent1"/>
+        </w:rPr>
+        <w:t xml:space="preserve">because Lasso </w:t>
+      </w:r>
+      <w:r>
+        <w:rPr>
+          <w:color w:val="156082" w:themeColor="accent1"/>
+        </w:rPr>
+        <w:t>“</w:t>
+      </w:r>
+      <w:r>
+        <w:rPr>
+          <w:color w:val="156082" w:themeColor="accent1"/>
+        </w:rPr>
+        <w:t xml:space="preserve">variable selection </w:t>
       </w:r>
       <w:proofErr w:type="gramStart"/>
       <w:r>
         <w:rPr>
           <w:color w:val="156082" w:themeColor="accent1"/>
-          <w:lang w:val="en-US"/>
-        </w:rPr>
-        <w:t xml:space="preserve">decrease </w:t>
-      </w:r>
-      <w:r>
-        <w:rPr>
-          <w:color w:val="156082" w:themeColor="accent1"/>
-          <w:lang w:val="en-US"/>
-        </w:rPr>
-        <w:t xml:space="preserve"> much</w:t>
+        </w:rPr>
+        <w:t xml:space="preserve">“ </w:t>
+      </w:r>
+      <w:r>
+        <w:rPr>
+          <w:color w:val="156082" w:themeColor="accent1"/>
+        </w:rPr>
+        <w:t>can</w:t>
       </w:r>
       <w:proofErr w:type="gramEnd"/>
       <w:r>
         <w:rPr>
           <w:color w:val="156082" w:themeColor="accent1"/>
-          <w:lang w:val="en-US"/>
-        </w:rPr>
-        <w:t xml:space="preserve"> </w:t>
-      </w:r>
-      <w:r>
-        <w:rPr>
-          <w:color w:val="156082" w:themeColor="accent1"/>
-          <w:lang w:val="en-US"/>
-        </w:rPr>
-        <w:t>the coefficients of features with the larger scales</w:t>
-      </w:r>
-      <w:r>
-        <w:rPr>
-          <w:color w:val="156082" w:themeColor="accent1"/>
-          <w:lang w:val="en-US"/>
-        </w:rPr>
-        <w:t xml:space="preserve"> relative to their size</w:t>
-      </w:r>
-      <w:r>
-        <w:rPr>
-          <w:color w:val="156082" w:themeColor="accent1"/>
-          <w:lang w:val="en-US"/>
-        </w:rPr>
-        <w:t>, even if they are less important than the other features. In the same way, it may over-penalize features with smaller scales.</w:t>
-      </w:r>
-    </w:p>
-    <w:p>
-      <w:pPr>
-        <w:rPr>
-          <w:color w:val="156082" w:themeColor="accent1"/>
-          <w:rtl/>
-          <w:lang w:val="en-US"/>
-        </w:rPr>
-      </w:pPr>
-      <w:proofErr w:type="gramStart"/>
-      <w:r>
-        <w:rPr>
-          <w:color w:val="156082" w:themeColor="accent1"/>
-          <w:lang w:val="en-US"/>
-        </w:rPr>
-        <w:t>So</w:t>
-      </w:r>
-      <w:proofErr w:type="gramEnd"/>
-      <w:r>
-        <w:rPr>
-          <w:color w:val="156082" w:themeColor="accent1"/>
-          <w:lang w:val="en-US"/>
-        </w:rPr>
-        <w:t xml:space="preserve"> we may get into a situation where less relevant features are retained, and important ones are discarded</w:t>
-      </w:r>
-      <w:r>
-        <w:rPr>
-          <w:color w:val="156082" w:themeColor="accent1"/>
-          <w:lang w:val="en-US"/>
-        </w:rPr>
-        <w:t xml:space="preserve"> due to scale difference</w:t>
-      </w:r>
-      <w:r>
-        <w:rPr>
-          <w:color w:val="156082" w:themeColor="accent1"/>
-          <w:lang w:val="en-US"/>
-        </w:rPr>
-        <w:t xml:space="preserve">. That </w:t>
-      </w:r>
-      <w:r>
-        <w:rPr>
-          <w:color w:val="156082" w:themeColor="accent1"/>
-          <w:lang w:val="en-US"/>
-        </w:rPr>
-        <w:t xml:space="preserve">can </w:t>
-      </w:r>
-      <w:r>
-        <w:rPr>
-          <w:color w:val="156082" w:themeColor="accent1"/>
-          <w:lang w:val="en-US"/>
-        </w:rPr>
-        <w:t>skew the results and hurt the performance of the model.</w:t>
-      </w:r>
-    </w:p>
-    <w:p>
-      <w:pPr>
-        <w:rPr>
-          <w:lang w:val="en-US"/>
-        </w:rPr>
-      </w:pPr>
+        </w:rPr>
+        <w:t xml:space="preserve"> be </w:t>
+      </w:r>
+      <w:r>
+        <w:rPr>
+          <w:color w:val="156082" w:themeColor="accent1"/>
+        </w:rPr>
+        <w:t xml:space="preserve">affected </w:t>
+      </w:r>
+      <w:r>
+        <w:rPr>
+          <w:color w:val="156082" w:themeColor="accent1"/>
+        </w:rPr>
+        <w:t>by feature scale. As a result, features with larger scales might be under-penalized, and those with smaller scales might be over-penalized. This imbalance can lead to retaining less relevant features and discarding important ones, ultimately skewing the model’s results and hurting its performance.</w:t>
+      </w:r>
     </w:p>
     <w:p>
       <w:pPr>
@@ -3879,7 +3911,7 @@
                     <pic:cNvPicPr/>
                   </pic:nvPicPr>
                   <pic:blipFill>
-                    <a:blip r:embed="rId25"/>
+                    <a:blip r:embed="rId26"/>
                     <a:stretch>
                       <a:fillRect/>
                     </a:stretch>
@@ -3903,6 +3935,118 @@
     <w:p>
       <w:pPr>
         <w:rPr>
+          <w:color w:val="156082" w:themeColor="accent1"/>
+          <w:lang w:val="en-US"/>
+        </w:rPr>
+      </w:pPr>
+      <w:r>
+        <w:rPr>
+          <w:color w:val="156082" w:themeColor="accent1"/>
+          <w:lang w:val="en-US"/>
+        </w:rPr>
+        <w:t xml:space="preserve">Regarding the </w:t>
+      </w:r>
+      <w:r>
+        <w:rPr>
+          <w:color w:val="156082" w:themeColor="accent1"/>
+          <w:lang w:val="en-US"/>
+        </w:rPr>
+        <w:t xml:space="preserve">trained lasso model coefficients, like before we expect for </w:t>
+      </w:r>
+      <w:proofErr w:type="gramStart"/>
+      <w:r>
+        <w:rPr>
+          <w:color w:val="156082" w:themeColor="accent1"/>
+          <w:lang w:val="en-US"/>
+        </w:rPr>
+        <w:t>large scaled</w:t>
+      </w:r>
+      <w:proofErr w:type="gramEnd"/>
+      <w:r>
+        <w:rPr>
+          <w:color w:val="156082" w:themeColor="accent1"/>
+          <w:lang w:val="en-US"/>
+        </w:rPr>
+        <w:t xml:space="preserve"> features to have non zero coefficients, and for smaller scaled features to have closer to zero coefficients.</w:t>
+      </w:r>
+    </w:p>
+    <w:p>
+      <w:pPr>
+        <w:rPr>
+          <w:color w:val="156082" w:themeColor="accent1"/>
+          <w:lang w:val="en-US"/>
+        </w:rPr>
+      </w:pPr>
+      <w:r>
+        <w:rPr>
+          <w:color w:val="156082" w:themeColor="accent1"/>
+          <w:lang w:val="en-US"/>
+        </w:rPr>
+        <w:t xml:space="preserve">Using the ridge regressor, since it has l2 regularization it tends to shrink coefficients to zero less than the l1 regularization used in the lasso model. </w:t>
+      </w:r>
+    </w:p>
+    <w:p>
+      <w:pPr>
+        <w:rPr>
+          <w:color w:val="156082" w:themeColor="accent1"/>
+          <w:lang w:val="en-US"/>
+        </w:rPr>
+      </w:pPr>
+      <w:r>
+        <w:rPr>
+          <w:color w:val="156082" w:themeColor="accent1"/>
+          <w:lang w:val="en-US"/>
+        </w:rPr>
+        <w:t xml:space="preserve">We can argue that the ridge model here is more </w:t>
+      </w:r>
+      <w:proofErr w:type="spellStart"/>
+      <w:r>
+        <w:rPr>
+          <w:color w:val="156082" w:themeColor="accent1"/>
+          <w:lang w:val="en-US"/>
+        </w:rPr>
+        <w:t>non_normalization</w:t>
+      </w:r>
+      <w:proofErr w:type="spellEnd"/>
+      <w:r>
+        <w:rPr>
+          <w:color w:val="156082" w:themeColor="accent1"/>
+          <w:lang w:val="en-US"/>
+        </w:rPr>
+        <w:t xml:space="preserve"> proof here since it tends to zero out less coefficients inherently.</w:t>
+      </w:r>
+    </w:p>
+    <w:p>
+      <w:pPr>
+        <w:rPr>
+          <w:lang w:val="en-US"/>
+        </w:rPr>
+      </w:pPr>
+    </w:p>
+    <w:p>
+      <w:pPr>
+        <w:rPr>
+          <w:lang w:val="en-US"/>
+        </w:rPr>
+      </w:pPr>
+    </w:p>
+    <w:p>
+      <w:pPr>
+        <w:rPr>
+          <w:lang w:val="en-US"/>
+        </w:rPr>
+      </w:pPr>
+    </w:p>
+    <w:p>
+      <w:pPr>
+        <w:rPr>
+          <w:lang w:val="en-US"/>
+        </w:rPr>
+      </w:pPr>
+    </w:p>
+    <w:p>
+      <w:pPr>
+        <w:rPr>
           <w:lang w:val="en-US"/>
         </w:rPr>
       </w:pPr>
@@ -3916,8 +4060,10 @@
       </w:pPr>
       <w:r>
         <w:rPr>
-          <w:lang w:val="en-US"/>
-        </w:rPr>
+          <w:noProof/>
+          <w:lang w:val="en-US"/>
+        </w:rPr>
+        <w:lastRenderedPageBreak/>
         <w:drawing>
           <wp:inline distT="0" distB="0" distL="0" distR="0" wp14:anchorId="00772AF0" wp14:editId="48AEBB50">
             <wp:extent cx="5943600" cy="1014095"/>
@@ -3934,7 +4080,7 @@
                     <pic:cNvPicPr/>
                   </pic:nvPicPr>
                   <pic:blipFill>
-                    <a:blip r:embed="rId26"/>
+                    <a:blip r:embed="rId27"/>
                     <a:stretch>
                       <a:fillRect/>
                     </a:stretch>
@@ -3966,21 +4112,37 @@
         <w:rPr>
           <w:color w:val="156082" w:themeColor="accent1"/>
         </w:rPr>
-        <w:t xml:space="preserve">The magnitude </w:t>
+        <w:t xml:space="preserve">The magnitude of </w:t>
+      </w:r>
+      <w:r>
+        <w:rPr>
+          <w:color w:val="156082" w:themeColor="accent1"/>
+          <w:lang w:val="en-US"/>
+        </w:rPr>
+        <w:t xml:space="preserve"> a polynomial feature involves multiple monomials and powers of them, potentially changing the scale of the new polynomial features relative to the original bas features.</w:t>
+      </w:r>
+    </w:p>
+    <w:p>
+      <w:pPr>
+        <w:rPr>
+          <w:color w:val="156082" w:themeColor="accent1"/>
+          <w:lang w:val="en-US"/>
+        </w:rPr>
+      </w:pPr>
+      <w:r>
+        <w:rPr>
+          <w:color w:val="156082" w:themeColor="accent1"/>
+          <w:lang w:val="en-US"/>
+        </w:rPr>
+        <w:t xml:space="preserve">We already saw in the lectures that the magnitude of the features can </w:t>
       </w:r>
       <w:proofErr w:type="gramStart"/>
       <w:r>
         <w:rPr>
           <w:color w:val="156082" w:themeColor="accent1"/>
-        </w:rPr>
-        <w:t xml:space="preserve">of </w:t>
-      </w:r>
-      <w:r>
-        <w:rPr>
-          <w:color w:val="156082" w:themeColor="accent1"/>
-          <w:lang w:val="en-US"/>
-        </w:rPr>
-        <w:t xml:space="preserve"> a</w:t>
+          <w:lang w:val="en-US"/>
+        </w:rPr>
+        <w:t>effect</w:t>
       </w:r>
       <w:proofErr w:type="gramEnd"/>
       <w:r>
@@ -3988,37 +4150,6 @@
           <w:color w:val="156082" w:themeColor="accent1"/>
           <w:lang w:val="en-US"/>
         </w:rPr>
-        <w:t xml:space="preserve"> polynomial feature involves multiple monomials and powers of them, potentially changing the scale of the new polynomial features relative to the original bas features.</w:t>
-      </w:r>
-    </w:p>
-    <w:p>
-      <w:pPr>
-        <w:rPr>
-          <w:color w:val="156082" w:themeColor="accent1"/>
-          <w:lang w:val="en-US"/>
-        </w:rPr>
-      </w:pPr>
-      <w:r>
-        <w:rPr>
-          <w:color w:val="156082" w:themeColor="accent1"/>
-          <w:lang w:val="en-US"/>
-        </w:rPr>
-        <w:t xml:space="preserve">We already saw in the lectures that the magnitude of the features can </w:t>
-      </w:r>
-      <w:proofErr w:type="gramStart"/>
-      <w:r>
-        <w:rPr>
-          <w:color w:val="156082" w:themeColor="accent1"/>
-          <w:lang w:val="en-US"/>
-        </w:rPr>
-        <w:t>effect</w:t>
-      </w:r>
-      <w:proofErr w:type="gramEnd"/>
-      <w:r>
-        <w:rPr>
-          <w:color w:val="156082" w:themeColor="accent1"/>
-          <w:lang w:val="en-US"/>
-        </w:rPr>
         <w:t xml:space="preserve"> learning especially when dealing with gradient descent.</w:t>
       </w:r>
     </w:p>
@@ -4038,9 +4169,9 @@
       </w:pPr>
       <w:r>
         <w:rPr>
-          <w:lang w:val="en-US"/>
-        </w:rPr>
-        <w:lastRenderedPageBreak/>
+          <w:noProof/>
+          <w:lang w:val="en-US"/>
+        </w:rPr>
         <w:drawing>
           <wp:inline distT="0" distB="0" distL="0" distR="0" wp14:anchorId="1AACE445" wp14:editId="53686B17">
             <wp:extent cx="5943600" cy="1070610"/>
@@ -4057,7 +4188,7 @@
                     <pic:cNvPicPr/>
                   </pic:nvPicPr>
                   <pic:blipFill>
-                    <a:blip r:embed="rId27"/>
+                    <a:blip r:embed="rId28"/>
                     <a:stretch>
                       <a:fillRect/>
                     </a:stretch>
@@ -4086,12 +4217,13 @@
       </w:pPr>
       <w:r>
         <w:rPr>
+          <w:noProof/>
           <w:lang w:val="en-US"/>
         </w:rPr>
         <w:drawing>
-          <wp:inline distT="0" distB="0" distL="0" distR="0" wp14:anchorId="7A5AC750" wp14:editId="034710EF">
-            <wp:extent cx="3992880" cy="3154631"/>
-            <wp:effectExtent l="0" t="0" r="7620" b="8255"/>
+          <wp:inline distT="0" distB="0" distL="0" distR="0" wp14:anchorId="7A5AC750" wp14:editId="02CFAACD">
+            <wp:extent cx="3016188" cy="2382982"/>
+            <wp:effectExtent l="0" t="0" r="0" b="5080"/>
             <wp:docPr id="2140821314" name="Picture 1"/>
             <wp:cNvGraphicFramePr>
               <a:graphicFrameLocks xmlns:a="http://schemas.openxmlformats.org/drawingml/2006/main" noChangeAspect="1"/>
@@ -4104,7 +4236,7 @@
                     <pic:cNvPicPr/>
                   </pic:nvPicPr>
                   <pic:blipFill>
-                    <a:blip r:embed="rId28"/>
+                    <a:blip r:embed="rId29"/>
                     <a:stretch>
                       <a:fillRect/>
                     </a:stretch>
@@ -4112,7 +4244,7 @@
                   <pic:spPr>
                     <a:xfrm>
                       <a:off x="0" y="0"/>
-                      <a:ext cx="4000663" cy="3160780"/>
+                      <a:ext cx="3034441" cy="2397403"/>
                     </a:xfrm>
                     <a:prstGeom prst="rect">
                       <a:avLst/>
@@ -4128,11 +4260,13 @@
     <w:p>
       <w:pPr>
         <w:rPr>
-          <w:lang w:val="en-US"/>
-        </w:rPr>
-      </w:pPr>
-      <w:r>
-        <w:rPr>
+          <w:rtl/>
+          <w:lang w:val="en-US"/>
+        </w:rPr>
+      </w:pPr>
+      <w:r>
+        <w:rPr>
+          <w:noProof/>
           <w:lang w:val="en-US"/>
         </w:rPr>
         <w:drawing>
@@ -4151,7 +4285,7 @@
                     <pic:cNvPicPr/>
                   </pic:nvPicPr>
                   <pic:blipFill>
-                    <a:blip r:embed="rId29"/>
+                    <a:blip r:embed="rId30"/>
                     <a:stretch>
                       <a:fillRect/>
                     </a:stretch>
@@ -4172,6 +4306,2847 @@
         </w:drawing>
       </w:r>
     </w:p>
+    <w:p>
+      <w:pPr>
+        <w:rPr>
+          <w:lang w:val="en-US"/>
+        </w:rPr>
+      </w:pPr>
+    </w:p>
+    <w:p>
+      <w:pPr>
+        <w:rPr>
+          <w:lang w:val="en-US"/>
+        </w:rPr>
+      </w:pPr>
+    </w:p>
+    <w:p>
+      <w:pPr>
+        <w:rPr>
+          <w:rtl/>
+          <w:lang w:val="en-US"/>
+        </w:rPr>
+      </w:pPr>
+    </w:p>
+    <w:p>
+      <w:pPr>
+        <w:rPr>
+          <w:rtl/>
+          <w:lang w:val="en-US"/>
+        </w:rPr>
+      </w:pPr>
+      <w:r>
+        <w:rPr>
+          <w:noProof/>
+          <w:lang w:val="en-US"/>
+        </w:rPr>
+        <w:lastRenderedPageBreak/>
+        <w:drawing>
+          <wp:inline distT="0" distB="0" distL="0" distR="0" wp14:anchorId="69DD39D2" wp14:editId="60463EDB">
+            <wp:extent cx="5943600" cy="1045210"/>
+            <wp:effectExtent l="0" t="0" r="0" b="0"/>
+            <wp:docPr id="673287915" name="Picture 1"/>
+            <wp:cNvGraphicFramePr>
+              <a:graphicFrameLocks xmlns:a="http://schemas.openxmlformats.org/drawingml/2006/main" noChangeAspect="1"/>
+            </wp:cNvGraphicFramePr>
+            <a:graphic xmlns:a="http://schemas.openxmlformats.org/drawingml/2006/main">
+              <a:graphicData uri="http://schemas.openxmlformats.org/drawingml/2006/picture">
+                <pic:pic xmlns:pic="http://schemas.openxmlformats.org/drawingml/2006/picture">
+                  <pic:nvPicPr>
+                    <pic:cNvPr id="673287915" name=""/>
+                    <pic:cNvPicPr/>
+                  </pic:nvPicPr>
+                  <pic:blipFill>
+                    <a:blip r:embed="rId31"/>
+                    <a:stretch>
+                      <a:fillRect/>
+                    </a:stretch>
+                  </pic:blipFill>
+                  <pic:spPr>
+                    <a:xfrm>
+                      <a:off x="0" y="0"/>
+                      <a:ext cx="5943600" cy="1045210"/>
+                    </a:xfrm>
+                    <a:prstGeom prst="rect">
+                      <a:avLst/>
+                    </a:prstGeom>
+                  </pic:spPr>
+                </pic:pic>
+              </a:graphicData>
+            </a:graphic>
+          </wp:inline>
+        </w:drawing>
+      </w:r>
+    </w:p>
+    <w:p>
+      <w:pPr>
+        <w:rPr>
+          <w:rtl/>
+          <w:lang w:val="en-US"/>
+        </w:rPr>
+      </w:pPr>
+      <w:r>
+        <w:rPr>
+          <w:noProof/>
+          <w:lang w:val="en-US"/>
+        </w:rPr>
+        <w:drawing>
+          <wp:inline distT="0" distB="0" distL="0" distR="0" wp14:anchorId="4A5DE6E5" wp14:editId="033A182E">
+            <wp:extent cx="5943600" cy="2218690"/>
+            <wp:effectExtent l="0" t="0" r="0" b="3810"/>
+            <wp:docPr id="1375385745" name="Picture 1" descr="A graph of a graph with blue and red dots&#10;&#10;Description automatically generated"/>
+            <wp:cNvGraphicFramePr>
+              <a:graphicFrameLocks xmlns:a="http://schemas.openxmlformats.org/drawingml/2006/main" noChangeAspect="1"/>
+            </wp:cNvGraphicFramePr>
+            <a:graphic xmlns:a="http://schemas.openxmlformats.org/drawingml/2006/main">
+              <a:graphicData uri="http://schemas.openxmlformats.org/drawingml/2006/picture">
+                <pic:pic xmlns:pic="http://schemas.openxmlformats.org/drawingml/2006/picture">
+                  <pic:nvPicPr>
+                    <pic:cNvPr id="1375385745" name="Picture 1" descr="A graph of a graph with blue and red dots&#10;&#10;Description automatically generated"/>
+                    <pic:cNvPicPr/>
+                  </pic:nvPicPr>
+                  <pic:blipFill>
+                    <a:blip r:embed="rId32"/>
+                    <a:stretch>
+                      <a:fillRect/>
+                    </a:stretch>
+                  </pic:blipFill>
+                  <pic:spPr>
+                    <a:xfrm>
+                      <a:off x="0" y="0"/>
+                      <a:ext cx="5943600" cy="2218690"/>
+                    </a:xfrm>
+                    <a:prstGeom prst="rect">
+                      <a:avLst/>
+                    </a:prstGeom>
+                  </pic:spPr>
+                </pic:pic>
+              </a:graphicData>
+            </a:graphic>
+          </wp:inline>
+        </w:drawing>
+      </w:r>
+    </w:p>
+    <w:p>
+      <w:pPr>
+        <w:rPr>
+          <w:rtl/>
+          <w:lang w:val="en-US"/>
+        </w:rPr>
+      </w:pPr>
+      <w:r>
+        <w:rPr>
+          <w:noProof/>
+          <w:lang w:val="en-US"/>
+        </w:rPr>
+        <w:drawing>
+          <wp:inline distT="0" distB="0" distL="0" distR="0" wp14:anchorId="384B3733" wp14:editId="2E8B2240">
+            <wp:extent cx="5943600" cy="1778635"/>
+            <wp:effectExtent l="0" t="0" r="0" b="0"/>
+            <wp:docPr id="1618675319" name="Picture 1" descr="A screenshot of a computer error&#10;&#10;Description automatically generated"/>
+            <wp:cNvGraphicFramePr>
+              <a:graphicFrameLocks xmlns:a="http://schemas.openxmlformats.org/drawingml/2006/main" noChangeAspect="1"/>
+            </wp:cNvGraphicFramePr>
+            <a:graphic xmlns:a="http://schemas.openxmlformats.org/drawingml/2006/main">
+              <a:graphicData uri="http://schemas.openxmlformats.org/drawingml/2006/picture">
+                <pic:pic xmlns:pic="http://schemas.openxmlformats.org/drawingml/2006/picture">
+                  <pic:nvPicPr>
+                    <pic:cNvPr id="1618675319" name="Picture 1" descr="A screenshot of a computer error&#10;&#10;Description automatically generated"/>
+                    <pic:cNvPicPr/>
+                  </pic:nvPicPr>
+                  <pic:blipFill>
+                    <a:blip r:embed="rId33"/>
+                    <a:stretch>
+                      <a:fillRect/>
+                    </a:stretch>
+                  </pic:blipFill>
+                  <pic:spPr>
+                    <a:xfrm>
+                      <a:off x="0" y="0"/>
+                      <a:ext cx="5943600" cy="1778635"/>
+                    </a:xfrm>
+                    <a:prstGeom prst="rect">
+                      <a:avLst/>
+                    </a:prstGeom>
+                  </pic:spPr>
+                </pic:pic>
+              </a:graphicData>
+            </a:graphic>
+          </wp:inline>
+        </w:drawing>
+      </w:r>
+    </w:p>
+    <w:tbl>
+      <w:tblPr>
+        <w:tblStyle w:val="TableGrid"/>
+        <w:tblW w:w="0" w:type="auto"/>
+        <w:tblLook w:val="04A0" w:firstRow="1" w:lastRow="0" w:firstColumn="1" w:lastColumn="0" w:noHBand="0" w:noVBand="1"/>
+      </w:tblPr>
+      <w:tblGrid>
+        <w:gridCol w:w="2402"/>
+        <w:gridCol w:w="1562"/>
+        <w:gridCol w:w="2552"/>
+        <w:gridCol w:w="2834"/>
+      </w:tblGrid>
+      <w:tr>
+        <w:tc>
+          <w:tcPr>
+            <w:tcW w:w="2402" w:type="dxa"/>
+            <w:shd w:val="clear" w:color="auto" w:fill="4C94D8" w:themeFill="text2" w:themeFillTint="80"/>
+          </w:tcPr>
+          <w:p>
+            <w:pPr>
+              <w:jc w:val="center"/>
+              <w:rPr>
+                <w:b/>
+                <w:bCs/>
+                <w:color w:val="FFFFFF" w:themeColor="background1"/>
+                <w:lang w:val="en-US"/>
+              </w:rPr>
+            </w:pPr>
+            <w:r>
+              <w:rPr>
+                <w:b/>
+                <w:bCs/>
+                <w:color w:val="FFFFFF" w:themeColor="background1"/>
+                <w:lang w:val="en-US"/>
+              </w:rPr>
+              <w:t>Model</w:t>
+            </w:r>
+          </w:p>
+        </w:tc>
+        <w:tc>
+          <w:tcPr>
+            <w:tcW w:w="1562" w:type="dxa"/>
+            <w:shd w:val="clear" w:color="auto" w:fill="4C94D8" w:themeFill="text2" w:themeFillTint="80"/>
+          </w:tcPr>
+          <w:p>
+            <w:pPr>
+              <w:jc w:val="center"/>
+              <w:rPr>
+                <w:b/>
+                <w:bCs/>
+                <w:color w:val="FFFFFF" w:themeColor="background1"/>
+                <w:lang w:val="en-US"/>
+              </w:rPr>
+            </w:pPr>
+            <w:r>
+              <w:rPr>
+                <w:b/>
+                <w:bCs/>
+                <w:color w:val="FFFFFF" w:themeColor="background1"/>
+                <w:lang w:val="en-US"/>
+              </w:rPr>
+              <w:t>Section</w:t>
+            </w:r>
+          </w:p>
+        </w:tc>
+        <w:tc>
+          <w:tcPr>
+            <w:tcW w:w="2552" w:type="dxa"/>
+            <w:shd w:val="clear" w:color="auto" w:fill="4C94D8" w:themeFill="text2" w:themeFillTint="80"/>
+          </w:tcPr>
+          <w:p>
+            <w:pPr>
+              <w:jc w:val="center"/>
+              <w:rPr>
+                <w:b/>
+                <w:bCs/>
+                <w:color w:val="FFFFFF" w:themeColor="background1"/>
+                <w:lang w:val="en-US"/>
+              </w:rPr>
+            </w:pPr>
+            <w:r>
+              <w:rPr>
+                <w:b/>
+                <w:bCs/>
+                <w:color w:val="FFFFFF" w:themeColor="background1"/>
+                <w:lang w:val="en-US"/>
+              </w:rPr>
+              <w:t>Train MSE</w:t>
+            </w:r>
+          </w:p>
+        </w:tc>
+        <w:tc>
+          <w:tcPr>
+            <w:tcW w:w="2834" w:type="dxa"/>
+            <w:shd w:val="clear" w:color="auto" w:fill="4C94D8" w:themeFill="text2" w:themeFillTint="80"/>
+          </w:tcPr>
+          <w:p>
+            <w:pPr>
+              <w:jc w:val="center"/>
+              <w:rPr>
+                <w:b/>
+                <w:bCs/>
+                <w:color w:val="FFFFFF" w:themeColor="background1"/>
+                <w:lang w:val="en-US"/>
+              </w:rPr>
+            </w:pPr>
+            <w:r>
+              <w:rPr>
+                <w:b/>
+                <w:bCs/>
+                <w:color w:val="FFFFFF" w:themeColor="background1"/>
+                <w:lang w:val="en-US"/>
+              </w:rPr>
+              <w:t>Valid MSE</w:t>
+            </w:r>
+          </w:p>
+        </w:tc>
+      </w:tr>
+      <w:tr>
+        <w:tc>
+          <w:tcPr>
+            <w:tcW w:w="2402" w:type="dxa"/>
+            <w:shd w:val="clear" w:color="auto" w:fill="DAE9F7" w:themeFill="text2" w:themeFillTint="1A"/>
+          </w:tcPr>
+          <w:p>
+            <w:pPr>
+              <w:jc w:val="center"/>
+              <w:rPr>
+                <w:lang w:val="en-US"/>
+              </w:rPr>
+            </w:pPr>
+          </w:p>
+        </w:tc>
+        <w:tc>
+          <w:tcPr>
+            <w:tcW w:w="1562" w:type="dxa"/>
+            <w:shd w:val="clear" w:color="auto" w:fill="DAE9F7" w:themeFill="text2" w:themeFillTint="1A"/>
+          </w:tcPr>
+          <w:p>
+            <w:pPr>
+              <w:jc w:val="center"/>
+              <w:rPr>
+                <w:lang w:val="en-US"/>
+              </w:rPr>
+            </w:pPr>
+          </w:p>
+        </w:tc>
+        <w:tc>
+          <w:tcPr>
+            <w:tcW w:w="5386" w:type="dxa"/>
+            <w:gridSpan w:val="2"/>
+            <w:shd w:val="clear" w:color="auto" w:fill="DAE9F7" w:themeFill="text2" w:themeFillTint="1A"/>
+          </w:tcPr>
+          <w:p>
+            <w:pPr>
+              <w:jc w:val="center"/>
+              <w:rPr>
+                <w:lang w:val="en-US"/>
+              </w:rPr>
+            </w:pPr>
+            <w:r>
+              <w:rPr>
+                <w:lang w:val="en-US"/>
+              </w:rPr>
+              <w:t>Cross validation</w:t>
+            </w:r>
+          </w:p>
+        </w:tc>
+      </w:tr>
+      <w:tr>
+        <w:tc>
+          <w:tcPr>
+            <w:tcW w:w="2402" w:type="dxa"/>
+          </w:tcPr>
+          <w:p>
+            <w:pPr>
+              <w:jc w:val="center"/>
+              <w:rPr>
+                <w:lang w:val="en-US"/>
+              </w:rPr>
+            </w:pPr>
+            <w:r>
+              <w:rPr>
+                <w:lang w:val="en-US"/>
+              </w:rPr>
+              <w:t>Dummy</w:t>
+            </w:r>
+          </w:p>
+        </w:tc>
+        <w:tc>
+          <w:tcPr>
+            <w:tcW w:w="1562" w:type="dxa"/>
+          </w:tcPr>
+          <w:p>
+            <w:pPr>
+              <w:jc w:val="center"/>
+              <w:rPr>
+                <w:lang w:val="en-US"/>
+              </w:rPr>
+            </w:pPr>
+            <w:r>
+              <w:rPr>
+                <w:lang w:val="en-US"/>
+              </w:rPr>
+              <w:t>2</w:t>
+            </w:r>
+          </w:p>
+        </w:tc>
+        <w:tc>
+          <w:tcPr>
+            <w:tcW w:w="2552" w:type="dxa"/>
+          </w:tcPr>
+          <w:p>
+            <w:pPr>
+              <w:jc w:val="center"/>
+              <w:rPr>
+                <w:sz w:val="22"/>
+                <w:szCs w:val="22"/>
+                <w:lang w:val="en-US"/>
+              </w:rPr>
+            </w:pPr>
+            <w:r>
+              <w:rPr>
+                <w:sz w:val="22"/>
+                <w:szCs w:val="22"/>
+                <w:lang w:val="en-US"/>
+              </w:rPr>
+              <w:t>0.06624823283856855</w:t>
+            </w:r>
+          </w:p>
+        </w:tc>
+        <w:tc>
+          <w:tcPr>
+            <w:tcW w:w="2834" w:type="dxa"/>
+          </w:tcPr>
+          <w:p>
+            <w:pPr>
+              <w:jc w:val="center"/>
+              <w:rPr>
+                <w:sz w:val="22"/>
+                <w:szCs w:val="22"/>
+                <w:lang w:val="en-US"/>
+              </w:rPr>
+            </w:pPr>
+            <w:r>
+              <w:rPr>
+                <w:sz w:val="22"/>
+                <w:szCs w:val="22"/>
+                <w:lang w:val="en-US"/>
+              </w:rPr>
+              <w:t>0.06655387736460414</w:t>
+            </w:r>
+          </w:p>
+        </w:tc>
+      </w:tr>
+      <w:tr>
+        <w:tc>
+          <w:tcPr>
+            <w:tcW w:w="2402" w:type="dxa"/>
+          </w:tcPr>
+          <w:p>
+            <w:pPr>
+              <w:jc w:val="center"/>
+              <w:rPr>
+                <w:lang w:val="en-US"/>
+              </w:rPr>
+            </w:pPr>
+            <w:r>
+              <w:rPr>
+                <w:lang w:val="en-US"/>
+              </w:rPr>
+              <w:t>Linear</w:t>
+            </w:r>
+          </w:p>
+        </w:tc>
+        <w:tc>
+          <w:tcPr>
+            <w:tcW w:w="1562" w:type="dxa"/>
+          </w:tcPr>
+          <w:p>
+            <w:pPr>
+              <w:jc w:val="center"/>
+              <w:rPr>
+                <w:lang w:val="en-US"/>
+              </w:rPr>
+            </w:pPr>
+            <w:r>
+              <w:rPr>
+                <w:lang w:val="en-US"/>
+              </w:rPr>
+              <w:t>2</w:t>
+            </w:r>
+          </w:p>
+        </w:tc>
+        <w:tc>
+          <w:tcPr>
+            <w:tcW w:w="2552" w:type="dxa"/>
+          </w:tcPr>
+          <w:p>
+            <w:pPr>
+              <w:jc w:val="center"/>
+              <w:rPr>
+                <w:sz w:val="22"/>
+                <w:szCs w:val="22"/>
+                <w:lang w:val="en-US"/>
+              </w:rPr>
+            </w:pPr>
+            <w:r>
+              <w:rPr>
+                <w:sz w:val="22"/>
+                <w:szCs w:val="22"/>
+                <w:lang w:val="en-US"/>
+              </w:rPr>
+              <w:t>0.02247694080209269</w:t>
+            </w:r>
+          </w:p>
+        </w:tc>
+        <w:tc>
+          <w:tcPr>
+            <w:tcW w:w="2834" w:type="dxa"/>
+          </w:tcPr>
+          <w:p>
+            <w:pPr>
+              <w:jc w:val="center"/>
+              <w:rPr>
+                <w:sz w:val="22"/>
+                <w:szCs w:val="22"/>
+                <w:lang w:val="en-US"/>
+              </w:rPr>
+            </w:pPr>
+            <w:r>
+              <w:rPr>
+                <w:sz w:val="22"/>
+                <w:szCs w:val="22"/>
+                <w:lang w:val="en-US"/>
+              </w:rPr>
+              <w:t>0.023206892546040265</w:t>
+            </w:r>
+          </w:p>
+        </w:tc>
+      </w:tr>
+      <w:tr>
+        <w:tc>
+          <w:tcPr>
+            <w:tcW w:w="2402" w:type="dxa"/>
+          </w:tcPr>
+          <w:p>
+            <w:pPr>
+              <w:jc w:val="center"/>
+              <w:rPr>
+                <w:lang w:val="en-US"/>
+              </w:rPr>
+            </w:pPr>
+            <w:r>
+              <w:rPr>
+                <w:lang w:val="en-US"/>
+              </w:rPr>
+              <w:t>Lasso Linear</w:t>
+            </w:r>
+          </w:p>
+        </w:tc>
+        <w:tc>
+          <w:tcPr>
+            <w:tcW w:w="1562" w:type="dxa"/>
+          </w:tcPr>
+          <w:p>
+            <w:pPr>
+              <w:jc w:val="center"/>
+              <w:rPr>
+                <w:lang w:val="en-US"/>
+              </w:rPr>
+            </w:pPr>
+            <w:r>
+              <w:rPr>
+                <w:lang w:val="en-US"/>
+              </w:rPr>
+              <w:t>3</w:t>
+            </w:r>
+          </w:p>
+        </w:tc>
+        <w:tc>
+          <w:tcPr>
+            <w:tcW w:w="2552" w:type="dxa"/>
+          </w:tcPr>
+          <w:p>
+            <w:pPr>
+              <w:jc w:val="center"/>
+              <w:rPr>
+                <w:sz w:val="22"/>
+                <w:szCs w:val="22"/>
+                <w:lang w:val="en-US"/>
+              </w:rPr>
+            </w:pPr>
+            <w:r>
+              <w:rPr>
+                <w:sz w:val="22"/>
+                <w:szCs w:val="22"/>
+                <w:lang w:val="en-US"/>
+              </w:rPr>
+              <w:t>0.022487430212685115</w:t>
+            </w:r>
+          </w:p>
+        </w:tc>
+        <w:tc>
+          <w:tcPr>
+            <w:tcW w:w="2834" w:type="dxa"/>
+          </w:tcPr>
+          <w:p>
+            <w:pPr>
+              <w:jc w:val="center"/>
+              <w:rPr>
+                <w:sz w:val="22"/>
+                <w:szCs w:val="22"/>
+                <w:lang w:val="en-US"/>
+              </w:rPr>
+            </w:pPr>
+            <w:r>
+              <w:rPr>
+                <w:sz w:val="22"/>
+                <w:szCs w:val="22"/>
+                <w:lang w:val="en-US"/>
+              </w:rPr>
+              <w:t>0.02313150258151016</w:t>
+            </w:r>
+          </w:p>
+        </w:tc>
+      </w:tr>
+      <w:tr>
+        <w:tc>
+          <w:tcPr>
+            <w:tcW w:w="2402" w:type="dxa"/>
+          </w:tcPr>
+          <w:p>
+            <w:pPr>
+              <w:jc w:val="center"/>
+              <w:rPr>
+                <w:lang w:val="en-US"/>
+              </w:rPr>
+            </w:pPr>
+            <w:r>
+              <w:rPr>
+                <w:lang w:val="en-US"/>
+              </w:rPr>
+              <w:t>Polynomial Lasso</w:t>
+            </w:r>
+          </w:p>
+        </w:tc>
+        <w:tc>
+          <w:tcPr>
+            <w:tcW w:w="1562" w:type="dxa"/>
+          </w:tcPr>
+          <w:p>
+            <w:pPr>
+              <w:jc w:val="center"/>
+              <w:rPr>
+                <w:lang w:val="en-US"/>
+              </w:rPr>
+            </w:pPr>
+            <w:r>
+              <w:rPr>
+                <w:lang w:val="en-US"/>
+              </w:rPr>
+              <w:t>4</w:t>
+            </w:r>
+          </w:p>
+        </w:tc>
+        <w:tc>
+          <w:tcPr>
+            <w:tcW w:w="2552" w:type="dxa"/>
+          </w:tcPr>
+          <w:p>
+            <w:pPr>
+              <w:jc w:val="center"/>
+              <w:rPr>
+                <w:sz w:val="22"/>
+                <w:szCs w:val="22"/>
+                <w:lang w:val="en-US"/>
+              </w:rPr>
+            </w:pPr>
+            <w:r>
+              <w:rPr>
+                <w:sz w:val="22"/>
+                <w:szCs w:val="22"/>
+                <w:lang w:val="en-US"/>
+              </w:rPr>
+              <w:t>0.01708488188749001</w:t>
+            </w:r>
+          </w:p>
+        </w:tc>
+        <w:tc>
+          <w:tcPr>
+            <w:tcW w:w="2834" w:type="dxa"/>
+          </w:tcPr>
+          <w:p>
+            <w:pPr>
+              <w:jc w:val="center"/>
+              <w:rPr>
+                <w:sz w:val="22"/>
+                <w:szCs w:val="22"/>
+                <w:lang w:val="en-US"/>
+              </w:rPr>
+            </w:pPr>
+            <w:r>
+              <w:rPr>
+                <w:sz w:val="22"/>
+                <w:szCs w:val="22"/>
+                <w:lang w:val="en-US"/>
+              </w:rPr>
+              <w:t>0.01841226323567999</w:t>
+            </w:r>
+          </w:p>
+        </w:tc>
+      </w:tr>
+    </w:tbl>
+    <w:p>
+      <w:pPr>
+        <w:rPr>
+          <w:lang w:val="en-US"/>
+        </w:rPr>
+      </w:pPr>
+    </w:p>
+    <w:p>
+      <w:pPr>
+        <w:rPr>
+          <w:lang w:val="en-US"/>
+        </w:rPr>
+      </w:pPr>
+    </w:p>
+    <w:p>
+      <w:pPr>
+        <w:rPr>
+          <w:lang w:val="en-US"/>
+        </w:rPr>
+      </w:pPr>
+    </w:p>
+    <w:p>
+      <w:pPr>
+        <w:rPr>
+          <w:lang w:val="en-US"/>
+        </w:rPr>
+      </w:pPr>
+    </w:p>
+    <w:p>
+      <w:pPr>
+        <w:rPr>
+          <w:lang w:val="en-US"/>
+        </w:rPr>
+      </w:pPr>
+    </w:p>
+    <w:p>
+      <w:pPr>
+        <w:rPr>
+          <w:rtl/>
+          <w:lang w:val="en-US"/>
+        </w:rPr>
+      </w:pPr>
+    </w:p>
+    <w:p>
+      <w:pPr>
+        <w:rPr>
+          <w:rtl/>
+          <w:lang w:val="en-US"/>
+        </w:rPr>
+      </w:pPr>
+      <w:r>
+        <w:rPr>
+          <w:noProof/>
+          <w:lang w:val="en-US"/>
+        </w:rPr>
+        <w:lastRenderedPageBreak/>
+        <w:drawing>
+          <wp:inline distT="0" distB="0" distL="0" distR="0" wp14:anchorId="07992E39" wp14:editId="13844AC1">
+            <wp:extent cx="5560291" cy="1458982"/>
+            <wp:effectExtent l="0" t="0" r="2540" b="1905"/>
+            <wp:docPr id="1128942074" name="Picture 1"/>
+            <wp:cNvGraphicFramePr>
+              <a:graphicFrameLocks xmlns:a="http://schemas.openxmlformats.org/drawingml/2006/main" noChangeAspect="1"/>
+            </wp:cNvGraphicFramePr>
+            <a:graphic xmlns:a="http://schemas.openxmlformats.org/drawingml/2006/main">
+              <a:graphicData uri="http://schemas.openxmlformats.org/drawingml/2006/picture">
+                <pic:pic xmlns:pic="http://schemas.openxmlformats.org/drawingml/2006/picture">
+                  <pic:nvPicPr>
+                    <pic:cNvPr id="1128942074" name=""/>
+                    <pic:cNvPicPr/>
+                  </pic:nvPicPr>
+                  <pic:blipFill>
+                    <a:blip r:embed="rId34"/>
+                    <a:stretch>
+                      <a:fillRect/>
+                    </a:stretch>
+                  </pic:blipFill>
+                  <pic:spPr>
+                    <a:xfrm>
+                      <a:off x="0" y="0"/>
+                      <a:ext cx="5563710" cy="1459879"/>
+                    </a:xfrm>
+                    <a:prstGeom prst="rect">
+                      <a:avLst/>
+                    </a:prstGeom>
+                  </pic:spPr>
+                </pic:pic>
+              </a:graphicData>
+            </a:graphic>
+          </wp:inline>
+        </w:drawing>
+      </w:r>
+    </w:p>
+    <w:p>
+      <w:pPr>
+        <w:rPr>
+          <w:lang w:val="en-US"/>
+        </w:rPr>
+      </w:pPr>
+      <w:r>
+        <w:rPr>
+          <w:noProof/>
+          <w:lang w:val="en-US"/>
+        </w:rPr>
+        <w:drawing>
+          <wp:inline distT="0" distB="0" distL="0" distR="0" wp14:anchorId="503E4EAA" wp14:editId="299C157D">
+            <wp:extent cx="3565236" cy="3142088"/>
+            <wp:effectExtent l="0" t="0" r="3810" b="0"/>
+            <wp:docPr id="1565283264" name="Picture 1"/>
+            <wp:cNvGraphicFramePr>
+              <a:graphicFrameLocks xmlns:a="http://schemas.openxmlformats.org/drawingml/2006/main" noChangeAspect="1"/>
+            </wp:cNvGraphicFramePr>
+            <a:graphic xmlns:a="http://schemas.openxmlformats.org/drawingml/2006/main">
+              <a:graphicData uri="http://schemas.openxmlformats.org/drawingml/2006/picture">
+                <pic:pic xmlns:pic="http://schemas.openxmlformats.org/drawingml/2006/picture">
+                  <pic:nvPicPr>
+                    <pic:cNvPr id="1565283264" name=""/>
+                    <pic:cNvPicPr/>
+                  </pic:nvPicPr>
+                  <pic:blipFill>
+                    <a:blip r:embed="rId35"/>
+                    <a:stretch>
+                      <a:fillRect/>
+                    </a:stretch>
+                  </pic:blipFill>
+                  <pic:spPr>
+                    <a:xfrm>
+                      <a:off x="0" y="0"/>
+                      <a:ext cx="3584503" cy="3159068"/>
+                    </a:xfrm>
+                    <a:prstGeom prst="rect">
+                      <a:avLst/>
+                    </a:prstGeom>
+                  </pic:spPr>
+                </pic:pic>
+              </a:graphicData>
+            </a:graphic>
+          </wp:inline>
+        </w:drawing>
+      </w:r>
+    </w:p>
+    <w:p>
+      <w:pPr>
+        <w:rPr>
+          <w:lang w:val="en-US"/>
+        </w:rPr>
+      </w:pPr>
+      <w:r>
+        <w:rPr>
+          <w:lang w:val="en-US"/>
+        </w:rPr>
+        <w:drawing>
+          <wp:inline distT="0" distB="0" distL="0" distR="0" wp14:anchorId="18F22F61" wp14:editId="0CDA9431">
+            <wp:extent cx="5943600" cy="548640"/>
+            <wp:effectExtent l="0" t="0" r="0" b="3810"/>
+            <wp:docPr id="239258711" name="Picture 1"/>
+            <wp:cNvGraphicFramePr>
+              <a:graphicFrameLocks xmlns:a="http://schemas.openxmlformats.org/drawingml/2006/main" noChangeAspect="1"/>
+            </wp:cNvGraphicFramePr>
+            <a:graphic xmlns:a="http://schemas.openxmlformats.org/drawingml/2006/main">
+              <a:graphicData uri="http://schemas.openxmlformats.org/drawingml/2006/picture">
+                <pic:pic xmlns:pic="http://schemas.openxmlformats.org/drawingml/2006/picture">
+                  <pic:nvPicPr>
+                    <pic:cNvPr id="239258711" name=""/>
+                    <pic:cNvPicPr/>
+                  </pic:nvPicPr>
+                  <pic:blipFill>
+                    <a:blip r:embed="rId36"/>
+                    <a:stretch>
+                      <a:fillRect/>
+                    </a:stretch>
+                  </pic:blipFill>
+                  <pic:spPr>
+                    <a:xfrm>
+                      <a:off x="0" y="0"/>
+                      <a:ext cx="5943600" cy="548640"/>
+                    </a:xfrm>
+                    <a:prstGeom prst="rect">
+                      <a:avLst/>
+                    </a:prstGeom>
+                  </pic:spPr>
+                </pic:pic>
+              </a:graphicData>
+            </a:graphic>
+          </wp:inline>
+        </w:drawing>
+      </w:r>
+    </w:p>
+    <w:p>
+      <w:pPr>
+        <w:rPr>
+          <w:lang w:val="en-US"/>
+        </w:rPr>
+      </w:pPr>
+    </w:p>
+    <w:p>
+      <w:pPr>
+        <w:rPr>
+          <w:lang w:val="en-US"/>
+        </w:rPr>
+      </w:pPr>
+    </w:p>
+    <w:p>
+      <w:pPr>
+        <w:rPr>
+          <w:lang w:val="en-US"/>
+        </w:rPr>
+      </w:pPr>
+    </w:p>
+    <w:p>
+      <w:pPr>
+        <w:rPr>
+          <w:lang w:val="en-US"/>
+        </w:rPr>
+      </w:pPr>
+    </w:p>
+    <w:p>
+      <w:pPr>
+        <w:rPr>
+          <w:rtl/>
+          <w:lang w:val="en-US"/>
+        </w:rPr>
+      </w:pPr>
+    </w:p>
+    <w:p>
+      <w:pPr>
+        <w:rPr>
+          <w:lang w:val="en-US"/>
+        </w:rPr>
+      </w:pPr>
+      <w:r>
+        <w:rPr>
+          <w:noProof/>
+          <w:lang w:val="en-US"/>
+        </w:rPr>
+        <w:lastRenderedPageBreak/>
+        <w:drawing>
+          <wp:inline distT="0" distB="0" distL="0" distR="0" wp14:anchorId="3BF4D096" wp14:editId="6BB2160F">
+            <wp:extent cx="5943600" cy="1711960"/>
+            <wp:effectExtent l="0" t="0" r="0" b="2540"/>
+            <wp:docPr id="1579880720" name="Picture 1" descr="A screenshot of a computer error&#10;&#10;Description automatically generated"/>
+            <wp:cNvGraphicFramePr>
+              <a:graphicFrameLocks xmlns:a="http://schemas.openxmlformats.org/drawingml/2006/main" noChangeAspect="1"/>
+            </wp:cNvGraphicFramePr>
+            <a:graphic xmlns:a="http://schemas.openxmlformats.org/drawingml/2006/main">
+              <a:graphicData uri="http://schemas.openxmlformats.org/drawingml/2006/picture">
+                <pic:pic xmlns:pic="http://schemas.openxmlformats.org/drawingml/2006/picture">
+                  <pic:nvPicPr>
+                    <pic:cNvPr id="1579880720" name="Picture 1" descr="A screenshot of a computer error&#10;&#10;Description automatically generated"/>
+                    <pic:cNvPicPr/>
+                  </pic:nvPicPr>
+                  <pic:blipFill>
+                    <a:blip r:embed="rId37"/>
+                    <a:stretch>
+                      <a:fillRect/>
+                    </a:stretch>
+                  </pic:blipFill>
+                  <pic:spPr>
+                    <a:xfrm>
+                      <a:off x="0" y="0"/>
+                      <a:ext cx="5943600" cy="1711960"/>
+                    </a:xfrm>
+                    <a:prstGeom prst="rect">
+                      <a:avLst/>
+                    </a:prstGeom>
+                  </pic:spPr>
+                </pic:pic>
+              </a:graphicData>
+            </a:graphic>
+          </wp:inline>
+        </w:drawing>
+      </w:r>
+    </w:p>
+    <w:tbl>
+      <w:tblPr>
+        <w:tblStyle w:val="TableGrid"/>
+        <w:tblW w:w="0" w:type="auto"/>
+        <w:tblLook w:val="04A0" w:firstRow="1" w:lastRow="0" w:firstColumn="1" w:lastColumn="0" w:noHBand="0" w:noVBand="1"/>
+      </w:tblPr>
+      <w:tblGrid>
+        <w:gridCol w:w="2356"/>
+        <w:gridCol w:w="1539"/>
+        <w:gridCol w:w="2630"/>
+        <w:gridCol w:w="2825"/>
+      </w:tblGrid>
+      <w:tr>
+        <w:tc>
+          <w:tcPr>
+            <w:tcW w:w="2402" w:type="dxa"/>
+            <w:shd w:val="clear" w:color="auto" w:fill="4C94D8" w:themeFill="text2" w:themeFillTint="80"/>
+          </w:tcPr>
+          <w:p>
+            <w:pPr>
+              <w:jc w:val="center"/>
+              <w:rPr>
+                <w:b/>
+                <w:bCs/>
+                <w:color w:val="FFFFFF" w:themeColor="background1"/>
+                <w:lang w:val="en-US"/>
+              </w:rPr>
+            </w:pPr>
+            <w:r>
+              <w:rPr>
+                <w:b/>
+                <w:bCs/>
+                <w:color w:val="FFFFFF" w:themeColor="background1"/>
+                <w:lang w:val="en-US"/>
+              </w:rPr>
+              <w:t>Model</w:t>
+            </w:r>
+          </w:p>
+        </w:tc>
+        <w:tc>
+          <w:tcPr>
+            <w:tcW w:w="1562" w:type="dxa"/>
+            <w:shd w:val="clear" w:color="auto" w:fill="4C94D8" w:themeFill="text2" w:themeFillTint="80"/>
+          </w:tcPr>
+          <w:p>
+            <w:pPr>
+              <w:jc w:val="center"/>
+              <w:rPr>
+                <w:b/>
+                <w:bCs/>
+                <w:color w:val="FFFFFF" w:themeColor="background1"/>
+                <w:lang w:val="en-US"/>
+              </w:rPr>
+            </w:pPr>
+            <w:r>
+              <w:rPr>
+                <w:b/>
+                <w:bCs/>
+                <w:color w:val="FFFFFF" w:themeColor="background1"/>
+                <w:lang w:val="en-US"/>
+              </w:rPr>
+              <w:t>Section</w:t>
+            </w:r>
+          </w:p>
+        </w:tc>
+        <w:tc>
+          <w:tcPr>
+            <w:tcW w:w="2552" w:type="dxa"/>
+            <w:shd w:val="clear" w:color="auto" w:fill="4C94D8" w:themeFill="text2" w:themeFillTint="80"/>
+          </w:tcPr>
+          <w:p>
+            <w:pPr>
+              <w:jc w:val="center"/>
+              <w:rPr>
+                <w:b/>
+                <w:bCs/>
+                <w:color w:val="FFFFFF" w:themeColor="background1"/>
+                <w:lang w:val="en-US"/>
+              </w:rPr>
+            </w:pPr>
+            <w:r>
+              <w:rPr>
+                <w:b/>
+                <w:bCs/>
+                <w:color w:val="FFFFFF" w:themeColor="background1"/>
+                <w:lang w:val="en-US"/>
+              </w:rPr>
+              <w:t>Train MSE</w:t>
+            </w:r>
+          </w:p>
+        </w:tc>
+        <w:tc>
+          <w:tcPr>
+            <w:tcW w:w="2834" w:type="dxa"/>
+            <w:shd w:val="clear" w:color="auto" w:fill="4C94D8" w:themeFill="text2" w:themeFillTint="80"/>
+          </w:tcPr>
+          <w:p>
+            <w:pPr>
+              <w:jc w:val="center"/>
+              <w:rPr>
+                <w:b/>
+                <w:bCs/>
+                <w:color w:val="FFFFFF" w:themeColor="background1"/>
+                <w:lang w:val="en-US"/>
+              </w:rPr>
+            </w:pPr>
+            <w:r>
+              <w:rPr>
+                <w:b/>
+                <w:bCs/>
+                <w:color w:val="FFFFFF" w:themeColor="background1"/>
+                <w:lang w:val="en-US"/>
+              </w:rPr>
+              <w:t>Valid MSE</w:t>
+            </w:r>
+          </w:p>
+        </w:tc>
+      </w:tr>
+      <w:tr>
+        <w:tc>
+          <w:tcPr>
+            <w:tcW w:w="2402" w:type="dxa"/>
+            <w:shd w:val="clear" w:color="auto" w:fill="DAE9F7" w:themeFill="text2" w:themeFillTint="1A"/>
+          </w:tcPr>
+          <w:p>
+            <w:pPr>
+              <w:jc w:val="center"/>
+              <w:rPr>
+                <w:lang w:val="en-US"/>
+              </w:rPr>
+            </w:pPr>
+          </w:p>
+        </w:tc>
+        <w:tc>
+          <w:tcPr>
+            <w:tcW w:w="1562" w:type="dxa"/>
+            <w:shd w:val="clear" w:color="auto" w:fill="DAE9F7" w:themeFill="text2" w:themeFillTint="1A"/>
+          </w:tcPr>
+          <w:p>
+            <w:pPr>
+              <w:jc w:val="center"/>
+              <w:rPr>
+                <w:lang w:val="en-US"/>
+              </w:rPr>
+            </w:pPr>
+          </w:p>
+        </w:tc>
+        <w:tc>
+          <w:tcPr>
+            <w:tcW w:w="5386" w:type="dxa"/>
+            <w:gridSpan w:val="2"/>
+            <w:shd w:val="clear" w:color="auto" w:fill="DAE9F7" w:themeFill="text2" w:themeFillTint="1A"/>
+          </w:tcPr>
+          <w:p>
+            <w:pPr>
+              <w:jc w:val="center"/>
+              <w:rPr>
+                <w:lang w:val="en-US"/>
+              </w:rPr>
+            </w:pPr>
+            <w:r>
+              <w:rPr>
+                <w:lang w:val="en-US"/>
+              </w:rPr>
+              <w:t>Cross validation</w:t>
+            </w:r>
+          </w:p>
+        </w:tc>
+      </w:tr>
+      <w:tr>
+        <w:tc>
+          <w:tcPr>
+            <w:tcW w:w="2402" w:type="dxa"/>
+          </w:tcPr>
+          <w:p>
+            <w:pPr>
+              <w:jc w:val="center"/>
+              <w:rPr>
+                <w:lang w:val="en-US"/>
+              </w:rPr>
+            </w:pPr>
+            <w:r>
+              <w:rPr>
+                <w:lang w:val="en-US"/>
+              </w:rPr>
+              <w:t>Dummy</w:t>
+            </w:r>
+          </w:p>
+        </w:tc>
+        <w:tc>
+          <w:tcPr>
+            <w:tcW w:w="1562" w:type="dxa"/>
+          </w:tcPr>
+          <w:p>
+            <w:pPr>
+              <w:jc w:val="center"/>
+              <w:rPr>
+                <w:lang w:val="en-US"/>
+              </w:rPr>
+            </w:pPr>
+            <w:r>
+              <w:rPr>
+                <w:lang w:val="en-US"/>
+              </w:rPr>
+              <w:t>2</w:t>
+            </w:r>
+          </w:p>
+        </w:tc>
+        <w:tc>
+          <w:tcPr>
+            <w:tcW w:w="2552" w:type="dxa"/>
+          </w:tcPr>
+          <w:p>
+            <w:pPr>
+              <w:jc w:val="center"/>
+              <w:rPr>
+                <w:sz w:val="22"/>
+                <w:szCs w:val="22"/>
+                <w:lang w:val="en-US"/>
+              </w:rPr>
+            </w:pPr>
+            <w:r>
+              <w:rPr>
+                <w:sz w:val="22"/>
+                <w:szCs w:val="22"/>
+                <w:lang w:val="en-US"/>
+              </w:rPr>
+              <w:t>0.06624823283856855</w:t>
+            </w:r>
+          </w:p>
+        </w:tc>
+        <w:tc>
+          <w:tcPr>
+            <w:tcW w:w="2834" w:type="dxa"/>
+          </w:tcPr>
+          <w:p>
+            <w:pPr>
+              <w:jc w:val="center"/>
+              <w:rPr>
+                <w:sz w:val="22"/>
+                <w:szCs w:val="22"/>
+                <w:lang w:val="en-US"/>
+              </w:rPr>
+            </w:pPr>
+            <w:r>
+              <w:rPr>
+                <w:sz w:val="22"/>
+                <w:szCs w:val="22"/>
+                <w:lang w:val="en-US"/>
+              </w:rPr>
+              <w:t>0.06655387736460414</w:t>
+            </w:r>
+          </w:p>
+        </w:tc>
+      </w:tr>
+      <w:tr>
+        <w:tc>
+          <w:tcPr>
+            <w:tcW w:w="2402" w:type="dxa"/>
+          </w:tcPr>
+          <w:p>
+            <w:pPr>
+              <w:jc w:val="center"/>
+              <w:rPr>
+                <w:lang w:val="en-US"/>
+              </w:rPr>
+            </w:pPr>
+            <w:r>
+              <w:rPr>
+                <w:lang w:val="en-US"/>
+              </w:rPr>
+              <w:t>Linear</w:t>
+            </w:r>
+          </w:p>
+        </w:tc>
+        <w:tc>
+          <w:tcPr>
+            <w:tcW w:w="1562" w:type="dxa"/>
+          </w:tcPr>
+          <w:p>
+            <w:pPr>
+              <w:jc w:val="center"/>
+              <w:rPr>
+                <w:lang w:val="en-US"/>
+              </w:rPr>
+            </w:pPr>
+            <w:r>
+              <w:rPr>
+                <w:lang w:val="en-US"/>
+              </w:rPr>
+              <w:t>2</w:t>
+            </w:r>
+          </w:p>
+        </w:tc>
+        <w:tc>
+          <w:tcPr>
+            <w:tcW w:w="2552" w:type="dxa"/>
+          </w:tcPr>
+          <w:p>
+            <w:pPr>
+              <w:jc w:val="center"/>
+              <w:rPr>
+                <w:sz w:val="22"/>
+                <w:szCs w:val="22"/>
+                <w:lang w:val="en-US"/>
+              </w:rPr>
+            </w:pPr>
+            <w:r>
+              <w:rPr>
+                <w:sz w:val="22"/>
+                <w:szCs w:val="22"/>
+                <w:lang w:val="en-US"/>
+              </w:rPr>
+              <w:t>0.02247694080209269</w:t>
+            </w:r>
+          </w:p>
+        </w:tc>
+        <w:tc>
+          <w:tcPr>
+            <w:tcW w:w="2834" w:type="dxa"/>
+          </w:tcPr>
+          <w:p>
+            <w:pPr>
+              <w:jc w:val="center"/>
+              <w:rPr>
+                <w:sz w:val="22"/>
+                <w:szCs w:val="22"/>
+                <w:lang w:val="en-US"/>
+              </w:rPr>
+            </w:pPr>
+            <w:r>
+              <w:rPr>
+                <w:sz w:val="22"/>
+                <w:szCs w:val="22"/>
+                <w:lang w:val="en-US"/>
+              </w:rPr>
+              <w:t>0.023206892546040265</w:t>
+            </w:r>
+          </w:p>
+        </w:tc>
+      </w:tr>
+      <w:tr>
+        <w:tc>
+          <w:tcPr>
+            <w:tcW w:w="2402" w:type="dxa"/>
+          </w:tcPr>
+          <w:p>
+            <w:pPr>
+              <w:jc w:val="center"/>
+              <w:rPr>
+                <w:lang w:val="en-US"/>
+              </w:rPr>
+            </w:pPr>
+            <w:r>
+              <w:rPr>
+                <w:lang w:val="en-US"/>
+              </w:rPr>
+              <w:t>Lasso Linear</w:t>
+            </w:r>
+          </w:p>
+        </w:tc>
+        <w:tc>
+          <w:tcPr>
+            <w:tcW w:w="1562" w:type="dxa"/>
+          </w:tcPr>
+          <w:p>
+            <w:pPr>
+              <w:jc w:val="center"/>
+              <w:rPr>
+                <w:lang w:val="en-US"/>
+              </w:rPr>
+            </w:pPr>
+            <w:r>
+              <w:rPr>
+                <w:lang w:val="en-US"/>
+              </w:rPr>
+              <w:t>3</w:t>
+            </w:r>
+          </w:p>
+        </w:tc>
+        <w:tc>
+          <w:tcPr>
+            <w:tcW w:w="2552" w:type="dxa"/>
+          </w:tcPr>
+          <w:p>
+            <w:pPr>
+              <w:jc w:val="center"/>
+              <w:rPr>
+                <w:sz w:val="22"/>
+                <w:szCs w:val="22"/>
+                <w:lang w:val="en-US"/>
+              </w:rPr>
+            </w:pPr>
+            <w:r>
+              <w:rPr>
+                <w:sz w:val="22"/>
+                <w:szCs w:val="22"/>
+                <w:lang w:val="en-US"/>
+              </w:rPr>
+              <w:t>0.022487430212685115</w:t>
+            </w:r>
+          </w:p>
+        </w:tc>
+        <w:tc>
+          <w:tcPr>
+            <w:tcW w:w="2834" w:type="dxa"/>
+          </w:tcPr>
+          <w:p>
+            <w:pPr>
+              <w:jc w:val="center"/>
+              <w:rPr>
+                <w:sz w:val="22"/>
+                <w:szCs w:val="22"/>
+                <w:lang w:val="en-US"/>
+              </w:rPr>
+            </w:pPr>
+            <w:r>
+              <w:rPr>
+                <w:sz w:val="22"/>
+                <w:szCs w:val="22"/>
+                <w:lang w:val="en-US"/>
+              </w:rPr>
+              <w:t>0.02313150258151016</w:t>
+            </w:r>
+          </w:p>
+        </w:tc>
+      </w:tr>
+      <w:tr>
+        <w:tc>
+          <w:tcPr>
+            <w:tcW w:w="2402" w:type="dxa"/>
+          </w:tcPr>
+          <w:p>
+            <w:pPr>
+              <w:jc w:val="center"/>
+              <w:rPr>
+                <w:lang w:val="en-US"/>
+              </w:rPr>
+            </w:pPr>
+            <w:r>
+              <w:rPr>
+                <w:lang w:val="en-US"/>
+              </w:rPr>
+              <w:t>Polynomial Lasso</w:t>
+            </w:r>
+          </w:p>
+        </w:tc>
+        <w:tc>
+          <w:tcPr>
+            <w:tcW w:w="1562" w:type="dxa"/>
+          </w:tcPr>
+          <w:p>
+            <w:pPr>
+              <w:jc w:val="center"/>
+              <w:rPr>
+                <w:lang w:val="en-US"/>
+              </w:rPr>
+            </w:pPr>
+            <w:r>
+              <w:rPr>
+                <w:lang w:val="en-US"/>
+              </w:rPr>
+              <w:t>4</w:t>
+            </w:r>
+          </w:p>
+        </w:tc>
+        <w:tc>
+          <w:tcPr>
+            <w:tcW w:w="2552" w:type="dxa"/>
+          </w:tcPr>
+          <w:p>
+            <w:pPr>
+              <w:jc w:val="center"/>
+              <w:rPr>
+                <w:sz w:val="22"/>
+                <w:szCs w:val="22"/>
+                <w:lang w:val="en-US"/>
+              </w:rPr>
+            </w:pPr>
+            <w:r>
+              <w:rPr>
+                <w:sz w:val="22"/>
+                <w:szCs w:val="22"/>
+                <w:lang w:val="en-US"/>
+              </w:rPr>
+              <w:t>0.01708488188749001</w:t>
+            </w:r>
+          </w:p>
+        </w:tc>
+        <w:tc>
+          <w:tcPr>
+            <w:tcW w:w="2834" w:type="dxa"/>
+          </w:tcPr>
+          <w:p>
+            <w:pPr>
+              <w:jc w:val="center"/>
+              <w:rPr>
+                <w:sz w:val="22"/>
+                <w:szCs w:val="22"/>
+                <w:lang w:val="en-US"/>
+              </w:rPr>
+            </w:pPr>
+            <w:r>
+              <w:rPr>
+                <w:sz w:val="22"/>
+                <w:szCs w:val="22"/>
+                <w:lang w:val="en-US"/>
+              </w:rPr>
+              <w:t>0.01841226323567999</w:t>
+            </w:r>
+          </w:p>
+        </w:tc>
+      </w:tr>
+      <w:tr>
+        <w:tc>
+          <w:tcPr>
+            <w:tcW w:w="2402" w:type="dxa"/>
+          </w:tcPr>
+          <w:p>
+            <w:pPr>
+              <w:jc w:val="center"/>
+              <w:rPr>
+                <w:lang w:val="en-US"/>
+              </w:rPr>
+            </w:pPr>
+            <w:r>
+              <w:rPr>
+                <w:lang w:val="en-US"/>
+              </w:rPr>
+              <w:t>GBM Regressor</w:t>
+            </w:r>
+          </w:p>
+        </w:tc>
+        <w:tc>
+          <w:tcPr>
+            <w:tcW w:w="1562" w:type="dxa"/>
+          </w:tcPr>
+          <w:p>
+            <w:pPr>
+              <w:jc w:val="center"/>
+              <w:rPr>
+                <w:lang w:val="en-US"/>
+              </w:rPr>
+            </w:pPr>
+            <w:r>
+              <w:rPr>
+                <w:lang w:val="en-US"/>
+              </w:rPr>
+              <w:t>5</w:t>
+            </w:r>
+          </w:p>
+        </w:tc>
+        <w:tc>
+          <w:tcPr>
+            <w:tcW w:w="2552" w:type="dxa"/>
+          </w:tcPr>
+          <w:p>
+            <w:pPr>
+              <w:jc w:val="center"/>
+              <w:rPr>
+                <w:sz w:val="22"/>
+                <w:szCs w:val="22"/>
+                <w:lang w:val="en-US"/>
+              </w:rPr>
+            </w:pPr>
+            <w:r>
+              <w:rPr>
+                <w:sz w:val="22"/>
+                <w:szCs w:val="22"/>
+                <w:lang w:val="en-US"/>
+              </w:rPr>
+              <w:t>0.0015133026206487735</w:t>
+            </w:r>
+          </w:p>
+        </w:tc>
+        <w:tc>
+          <w:tcPr>
+            <w:tcW w:w="2834" w:type="dxa"/>
+          </w:tcPr>
+          <w:p>
+            <w:pPr>
+              <w:jc w:val="center"/>
+              <w:rPr>
+                <w:sz w:val="22"/>
+                <w:szCs w:val="22"/>
+                <w:lang w:val="en-US"/>
+              </w:rPr>
+            </w:pPr>
+            <w:r>
+              <w:rPr>
+                <w:sz w:val="22"/>
+                <w:szCs w:val="22"/>
+                <w:lang w:val="en-US"/>
+              </w:rPr>
+              <w:t>0.0010523804993928887</w:t>
+            </w:r>
+          </w:p>
+        </w:tc>
+      </w:tr>
+    </w:tbl>
+    <w:p>
+      <w:pPr>
+        <w:rPr>
+          <w:lang w:val="en-US"/>
+        </w:rPr>
+      </w:pPr>
+    </w:p>
+    <w:p>
+      <w:pPr>
+        <w:rPr>
+          <w:lang w:val="en-US"/>
+        </w:rPr>
+      </w:pPr>
+    </w:p>
+    <w:p>
+      <w:pPr>
+        <w:rPr>
+          <w:lang w:val="en-US"/>
+        </w:rPr>
+      </w:pPr>
+    </w:p>
+    <w:p>
+      <w:pPr>
+        <w:rPr>
+          <w:lang w:val="en-US"/>
+        </w:rPr>
+      </w:pPr>
+    </w:p>
+    <w:p>
+      <w:pPr>
+        <w:rPr>
+          <w:lang w:val="en-US"/>
+        </w:rPr>
+      </w:pPr>
+    </w:p>
+    <w:p>
+      <w:pPr>
+        <w:rPr>
+          <w:lang w:val="en-US"/>
+        </w:rPr>
+      </w:pPr>
+    </w:p>
+    <w:p>
+      <w:pPr>
+        <w:rPr>
+          <w:lang w:val="en-US"/>
+        </w:rPr>
+      </w:pPr>
+    </w:p>
+    <w:p>
+      <w:pPr>
+        <w:rPr>
+          <w:lang w:val="en-US"/>
+        </w:rPr>
+      </w:pPr>
+    </w:p>
+    <w:p>
+      <w:pPr>
+        <w:rPr>
+          <w:lang w:val="en-US"/>
+        </w:rPr>
+      </w:pPr>
+    </w:p>
+    <w:p>
+      <w:pPr>
+        <w:rPr>
+          <w:lang w:val="en-US"/>
+        </w:rPr>
+      </w:pPr>
+    </w:p>
+    <w:p>
+      <w:pPr>
+        <w:rPr>
+          <w:rtl/>
+          <w:lang w:val="en-US"/>
+        </w:rPr>
+      </w:pPr>
+    </w:p>
+    <w:p>
+      <w:pPr>
+        <w:rPr>
+          <w:rtl/>
+          <w:lang w:val="en-US"/>
+        </w:rPr>
+      </w:pPr>
+      <w:r>
+        <w:rPr>
+          <w:noProof/>
+          <w:lang w:val="en-US"/>
+        </w:rPr>
+        <w:lastRenderedPageBreak/>
+        <w:drawing>
+          <wp:inline distT="0" distB="0" distL="0" distR="0" wp14:anchorId="7119B55C" wp14:editId="0E3393AA">
+            <wp:extent cx="5943600" cy="2022764"/>
+            <wp:effectExtent l="0" t="0" r="0" b="0"/>
+            <wp:docPr id="1379556176" name="Picture 1" descr="A table with text and numbers&#10;&#10;Description automatically generated with medium confidence"/>
+            <wp:cNvGraphicFramePr>
+              <a:graphicFrameLocks xmlns:a="http://schemas.openxmlformats.org/drawingml/2006/main" noChangeAspect="1"/>
+            </wp:cNvGraphicFramePr>
+            <a:graphic xmlns:a="http://schemas.openxmlformats.org/drawingml/2006/main">
+              <a:graphicData uri="http://schemas.openxmlformats.org/drawingml/2006/picture">
+                <pic:pic xmlns:pic="http://schemas.openxmlformats.org/drawingml/2006/picture">
+                  <pic:nvPicPr>
+                    <pic:cNvPr id="1379556176" name="Picture 1" descr="A table with text and numbers&#10;&#10;Description automatically generated with medium confidence"/>
+                    <pic:cNvPicPr/>
+                  </pic:nvPicPr>
+                  <pic:blipFill rotWithShape="1">
+                    <a:blip r:embed="rId38"/>
+                    <a:srcRect b="47720"/>
+                    <a:stretch/>
+                  </pic:blipFill>
+                  <pic:spPr bwMode="auto">
+                    <a:xfrm>
+                      <a:off x="0" y="0"/>
+                      <a:ext cx="5943600" cy="2022764"/>
+                    </a:xfrm>
+                    <a:prstGeom prst="rect">
+                      <a:avLst/>
+                    </a:prstGeom>
+                    <a:ln>
+                      <a:noFill/>
+                    </a:ln>
+                    <a:extLst>
+                      <a:ext uri="{53640926-AAD7-44D8-BBD7-CCE9431645EC}">
+                        <a14:shadowObscured xmlns:a14="http://schemas.microsoft.com/office/drawing/2010/main"/>
+                      </a:ext>
+                    </a:extLst>
+                  </pic:spPr>
+                </pic:pic>
+              </a:graphicData>
+            </a:graphic>
+          </wp:inline>
+        </w:drawing>
+      </w:r>
+    </w:p>
+    <w:p>
+      <w:pPr>
+        <w:rPr>
+          <w:lang w:val="en-US"/>
+        </w:rPr>
+      </w:pPr>
+      <w:r>
+        <w:rPr>
+          <w:noProof/>
+          <w:lang w:val="en-US"/>
+        </w:rPr>
+        <w:drawing>
+          <wp:inline distT="0" distB="0" distL="0" distR="0" wp14:anchorId="097F5548" wp14:editId="0CB7BBBB">
+            <wp:extent cx="5943600" cy="904183"/>
+            <wp:effectExtent l="0" t="0" r="0" b="0"/>
+            <wp:docPr id="1608693851" name="Picture 1" descr="A table with text and numbers&#10;&#10;Description automatically generated with medium confidence"/>
+            <wp:cNvGraphicFramePr>
+              <a:graphicFrameLocks xmlns:a="http://schemas.openxmlformats.org/drawingml/2006/main" noChangeAspect="1"/>
+            </wp:cNvGraphicFramePr>
+            <a:graphic xmlns:a="http://schemas.openxmlformats.org/drawingml/2006/main">
+              <a:graphicData uri="http://schemas.openxmlformats.org/drawingml/2006/picture">
+                <pic:pic xmlns:pic="http://schemas.openxmlformats.org/drawingml/2006/picture">
+                  <pic:nvPicPr>
+                    <pic:cNvPr id="1379556176" name="Picture 1" descr="A table with text and numbers&#10;&#10;Description automatically generated with medium confidence"/>
+                    <pic:cNvPicPr/>
+                  </pic:nvPicPr>
+                  <pic:blipFill rotWithShape="1">
+                    <a:blip r:embed="rId38"/>
+                    <a:srcRect t="76630"/>
+                    <a:stretch/>
+                  </pic:blipFill>
+                  <pic:spPr bwMode="auto">
+                    <a:xfrm>
+                      <a:off x="0" y="0"/>
+                      <a:ext cx="5943600" cy="904183"/>
+                    </a:xfrm>
+                    <a:prstGeom prst="rect">
+                      <a:avLst/>
+                    </a:prstGeom>
+                    <a:ln>
+                      <a:noFill/>
+                    </a:ln>
+                    <a:extLst>
+                      <a:ext uri="{53640926-AAD7-44D8-BBD7-CCE9431645EC}">
+                        <a14:shadowObscured xmlns:a14="http://schemas.microsoft.com/office/drawing/2010/main"/>
+                      </a:ext>
+                    </a:extLst>
+                  </pic:spPr>
+                </pic:pic>
+              </a:graphicData>
+            </a:graphic>
+          </wp:inline>
+        </w:drawing>
+      </w:r>
+    </w:p>
+    <w:tbl>
+      <w:tblPr>
+        <w:tblStyle w:val="TableGrid"/>
+        <w:tblW w:w="0" w:type="auto"/>
+        <w:tblLook w:val="04A0" w:firstRow="1" w:lastRow="0" w:firstColumn="1" w:lastColumn="0" w:noHBand="0" w:noVBand="1"/>
+      </w:tblPr>
+      <w:tblGrid>
+        <w:gridCol w:w="1659"/>
+        <w:gridCol w:w="1054"/>
+        <w:gridCol w:w="2669"/>
+        <w:gridCol w:w="2767"/>
+        <w:gridCol w:w="1201"/>
+      </w:tblGrid>
+      <w:tr>
+        <w:tc>
+          <w:tcPr>
+            <w:tcW w:w="1659" w:type="dxa"/>
+            <w:shd w:val="clear" w:color="auto" w:fill="4C94D8" w:themeFill="text2" w:themeFillTint="80"/>
+          </w:tcPr>
+          <w:p>
+            <w:pPr>
+              <w:jc w:val="center"/>
+              <w:rPr>
+                <w:b/>
+                <w:bCs/>
+                <w:color w:val="FFFFFF" w:themeColor="background1"/>
+                <w:lang w:val="en-US"/>
+              </w:rPr>
+            </w:pPr>
+            <w:r>
+              <w:rPr>
+                <w:b/>
+                <w:bCs/>
+                <w:color w:val="FFFFFF" w:themeColor="background1"/>
+                <w:lang w:val="en-US"/>
+              </w:rPr>
+              <w:t>Model</w:t>
+            </w:r>
+          </w:p>
+        </w:tc>
+        <w:tc>
+          <w:tcPr>
+            <w:tcW w:w="1054" w:type="dxa"/>
+            <w:shd w:val="clear" w:color="auto" w:fill="4C94D8" w:themeFill="text2" w:themeFillTint="80"/>
+          </w:tcPr>
+          <w:p>
+            <w:pPr>
+              <w:jc w:val="center"/>
+              <w:rPr>
+                <w:b/>
+                <w:bCs/>
+                <w:color w:val="FFFFFF" w:themeColor="background1"/>
+                <w:lang w:val="en-US"/>
+              </w:rPr>
+            </w:pPr>
+            <w:r>
+              <w:rPr>
+                <w:b/>
+                <w:bCs/>
+                <w:color w:val="FFFFFF" w:themeColor="background1"/>
+                <w:lang w:val="en-US"/>
+              </w:rPr>
+              <w:t>Section</w:t>
+            </w:r>
+          </w:p>
+        </w:tc>
+        <w:tc>
+          <w:tcPr>
+            <w:tcW w:w="2669" w:type="dxa"/>
+            <w:shd w:val="clear" w:color="auto" w:fill="4C94D8" w:themeFill="text2" w:themeFillTint="80"/>
+          </w:tcPr>
+          <w:p>
+            <w:pPr>
+              <w:jc w:val="center"/>
+              <w:rPr>
+                <w:b/>
+                <w:bCs/>
+                <w:color w:val="FFFFFF" w:themeColor="background1"/>
+                <w:lang w:val="en-US"/>
+              </w:rPr>
+            </w:pPr>
+            <w:r>
+              <w:rPr>
+                <w:b/>
+                <w:bCs/>
+                <w:color w:val="FFFFFF" w:themeColor="background1"/>
+                <w:lang w:val="en-US"/>
+              </w:rPr>
+              <w:t>Train MSE</w:t>
+            </w:r>
+          </w:p>
+        </w:tc>
+        <w:tc>
+          <w:tcPr>
+            <w:tcW w:w="2767" w:type="dxa"/>
+            <w:shd w:val="clear" w:color="auto" w:fill="4C94D8" w:themeFill="text2" w:themeFillTint="80"/>
+          </w:tcPr>
+          <w:p>
+            <w:pPr>
+              <w:jc w:val="center"/>
+              <w:rPr>
+                <w:b/>
+                <w:bCs/>
+                <w:color w:val="FFFFFF" w:themeColor="background1"/>
+                <w:lang w:val="en-US"/>
+              </w:rPr>
+            </w:pPr>
+            <w:r>
+              <w:rPr>
+                <w:b/>
+                <w:bCs/>
+                <w:color w:val="FFFFFF" w:themeColor="background1"/>
+                <w:lang w:val="en-US"/>
+              </w:rPr>
+              <w:t>Valid MSE</w:t>
+            </w:r>
+          </w:p>
+        </w:tc>
+        <w:tc>
+          <w:tcPr>
+            <w:tcW w:w="1201" w:type="dxa"/>
+            <w:shd w:val="clear" w:color="auto" w:fill="4C94D8" w:themeFill="text2" w:themeFillTint="80"/>
+          </w:tcPr>
+          <w:p>
+            <w:pPr>
+              <w:jc w:val="center"/>
+              <w:rPr>
+                <w:b/>
+                <w:bCs/>
+                <w:color w:val="FFFFFF" w:themeColor="background1"/>
+                <w:lang w:val="en-US"/>
+              </w:rPr>
+            </w:pPr>
+            <w:r>
+              <w:rPr>
+                <w:b/>
+                <w:bCs/>
+                <w:color w:val="FFFFFF" w:themeColor="background1"/>
+                <w:lang w:val="en-US"/>
+              </w:rPr>
+              <w:t>Test MSE</w:t>
+            </w:r>
+          </w:p>
+        </w:tc>
+      </w:tr>
+      <w:tr>
+        <w:tc>
+          <w:tcPr>
+            <w:tcW w:w="1659" w:type="dxa"/>
+            <w:shd w:val="clear" w:color="auto" w:fill="DAE9F7" w:themeFill="text2" w:themeFillTint="1A"/>
+          </w:tcPr>
+          <w:p>
+            <w:pPr>
+              <w:jc w:val="center"/>
+              <w:rPr>
+                <w:lang w:val="en-US"/>
+              </w:rPr>
+            </w:pPr>
+          </w:p>
+        </w:tc>
+        <w:tc>
+          <w:tcPr>
+            <w:tcW w:w="1054" w:type="dxa"/>
+            <w:shd w:val="clear" w:color="auto" w:fill="DAE9F7" w:themeFill="text2" w:themeFillTint="1A"/>
+          </w:tcPr>
+          <w:p>
+            <w:pPr>
+              <w:jc w:val="center"/>
+              <w:rPr>
+                <w:lang w:val="en-US"/>
+              </w:rPr>
+            </w:pPr>
+          </w:p>
+        </w:tc>
+        <w:tc>
+          <w:tcPr>
+            <w:tcW w:w="5436" w:type="dxa"/>
+            <w:gridSpan w:val="2"/>
+            <w:shd w:val="clear" w:color="auto" w:fill="DAE9F7" w:themeFill="text2" w:themeFillTint="1A"/>
+          </w:tcPr>
+          <w:p>
+            <w:pPr>
+              <w:jc w:val="center"/>
+              <w:rPr>
+                <w:sz w:val="22"/>
+                <w:szCs w:val="22"/>
+                <w:lang w:val="en-US"/>
+              </w:rPr>
+            </w:pPr>
+            <w:r>
+              <w:rPr>
+                <w:sz w:val="22"/>
+                <w:szCs w:val="22"/>
+                <w:lang w:val="en-US"/>
+              </w:rPr>
+              <w:t>Cross validation</w:t>
+            </w:r>
+          </w:p>
+        </w:tc>
+        <w:tc>
+          <w:tcPr>
+            <w:tcW w:w="1201" w:type="dxa"/>
+            <w:shd w:val="clear" w:color="auto" w:fill="DAE9F7" w:themeFill="text2" w:themeFillTint="1A"/>
+          </w:tcPr>
+          <w:p>
+            <w:pPr>
+              <w:jc w:val="center"/>
+              <w:rPr>
+                <w:sz w:val="22"/>
+                <w:szCs w:val="22"/>
+                <w:lang w:val="en-US"/>
+              </w:rPr>
+            </w:pPr>
+            <w:r>
+              <w:rPr>
+                <w:sz w:val="22"/>
+                <w:szCs w:val="22"/>
+                <w:lang w:val="en-US"/>
+              </w:rPr>
+              <w:t>Retrained</w:t>
+            </w:r>
+          </w:p>
+        </w:tc>
+      </w:tr>
+      <w:tr>
+        <w:tc>
+          <w:tcPr>
+            <w:tcW w:w="1659" w:type="dxa"/>
+          </w:tcPr>
+          <w:p>
+            <w:pPr>
+              <w:jc w:val="center"/>
+              <w:rPr>
+                <w:lang w:val="en-US"/>
+              </w:rPr>
+            </w:pPr>
+            <w:r>
+              <w:rPr>
+                <w:lang w:val="en-US"/>
+              </w:rPr>
+              <w:t>Dummy</w:t>
+            </w:r>
+          </w:p>
+        </w:tc>
+        <w:tc>
+          <w:tcPr>
+            <w:tcW w:w="1054" w:type="dxa"/>
+          </w:tcPr>
+          <w:p>
+            <w:pPr>
+              <w:jc w:val="center"/>
+              <w:rPr>
+                <w:lang w:val="en-US"/>
+              </w:rPr>
+            </w:pPr>
+            <w:r>
+              <w:rPr>
+                <w:lang w:val="en-US"/>
+              </w:rPr>
+              <w:t>2</w:t>
+            </w:r>
+          </w:p>
+        </w:tc>
+        <w:tc>
+          <w:tcPr>
+            <w:tcW w:w="2669" w:type="dxa"/>
+          </w:tcPr>
+          <w:p>
+            <w:pPr>
+              <w:jc w:val="center"/>
+              <w:rPr>
+                <w:sz w:val="22"/>
+                <w:szCs w:val="22"/>
+                <w:lang w:val="en-US"/>
+              </w:rPr>
+            </w:pPr>
+            <w:r>
+              <w:rPr>
+                <w:sz w:val="22"/>
+                <w:szCs w:val="22"/>
+                <w:lang w:val="en-US"/>
+              </w:rPr>
+              <w:t>0.06624823283856855</w:t>
+            </w:r>
+          </w:p>
+        </w:tc>
+        <w:tc>
+          <w:tcPr>
+            <w:tcW w:w="2767" w:type="dxa"/>
+          </w:tcPr>
+          <w:p>
+            <w:pPr>
+              <w:jc w:val="center"/>
+              <w:rPr>
+                <w:sz w:val="22"/>
+                <w:szCs w:val="22"/>
+                <w:lang w:val="en-US"/>
+              </w:rPr>
+            </w:pPr>
+            <w:r>
+              <w:rPr>
+                <w:sz w:val="22"/>
+                <w:szCs w:val="22"/>
+                <w:lang w:val="en-US"/>
+              </w:rPr>
+              <w:t>0.06655387736460414</w:t>
+            </w:r>
+          </w:p>
+        </w:tc>
+        <w:tc>
+          <w:tcPr>
+            <w:tcW w:w="1201" w:type="dxa"/>
+          </w:tcPr>
+          <w:p>
+            <w:pPr>
+              <w:jc w:val="center"/>
+              <w:rPr>
+                <w:sz w:val="22"/>
+                <w:szCs w:val="22"/>
+                <w:lang w:val="en-US"/>
+              </w:rPr>
+            </w:pPr>
+            <w:r>
+              <w:rPr>
+                <w:rFonts w:hint="cs"/>
+                <w:sz w:val="22"/>
+                <w:szCs w:val="22"/>
+                <w:rtl/>
+                <w:lang w:val="en-US"/>
+              </w:rPr>
+              <w:t>0.07060</w:t>
+            </w:r>
+          </w:p>
+        </w:tc>
+      </w:tr>
+      <w:tr>
+        <w:tc>
+          <w:tcPr>
+            <w:tcW w:w="1659" w:type="dxa"/>
+          </w:tcPr>
+          <w:p>
+            <w:pPr>
+              <w:jc w:val="center"/>
+              <w:rPr>
+                <w:lang w:val="en-US"/>
+              </w:rPr>
+            </w:pPr>
+            <w:r>
+              <w:rPr>
+                <w:lang w:val="en-US"/>
+              </w:rPr>
+              <w:t>Linear</w:t>
+            </w:r>
+          </w:p>
+        </w:tc>
+        <w:tc>
+          <w:tcPr>
+            <w:tcW w:w="1054" w:type="dxa"/>
+          </w:tcPr>
+          <w:p>
+            <w:pPr>
+              <w:jc w:val="center"/>
+              <w:rPr>
+                <w:lang w:val="en-US"/>
+              </w:rPr>
+            </w:pPr>
+            <w:r>
+              <w:rPr>
+                <w:lang w:val="en-US"/>
+              </w:rPr>
+              <w:t>2</w:t>
+            </w:r>
+          </w:p>
+        </w:tc>
+        <w:tc>
+          <w:tcPr>
+            <w:tcW w:w="2669" w:type="dxa"/>
+          </w:tcPr>
+          <w:p>
+            <w:pPr>
+              <w:jc w:val="center"/>
+              <w:rPr>
+                <w:sz w:val="22"/>
+                <w:szCs w:val="22"/>
+                <w:lang w:val="en-US"/>
+              </w:rPr>
+            </w:pPr>
+            <w:r>
+              <w:rPr>
+                <w:sz w:val="22"/>
+                <w:szCs w:val="22"/>
+                <w:lang w:val="en-US"/>
+              </w:rPr>
+              <w:t>0.02247694080209269</w:t>
+            </w:r>
+          </w:p>
+        </w:tc>
+        <w:tc>
+          <w:tcPr>
+            <w:tcW w:w="2767" w:type="dxa"/>
+          </w:tcPr>
+          <w:p>
+            <w:pPr>
+              <w:jc w:val="center"/>
+              <w:rPr>
+                <w:sz w:val="22"/>
+                <w:szCs w:val="22"/>
+                <w:lang w:val="en-US"/>
+              </w:rPr>
+            </w:pPr>
+            <w:r>
+              <w:rPr>
+                <w:sz w:val="22"/>
+                <w:szCs w:val="22"/>
+                <w:lang w:val="en-US"/>
+              </w:rPr>
+              <w:t>0.023206892546040265</w:t>
+            </w:r>
+          </w:p>
+        </w:tc>
+        <w:tc>
+          <w:tcPr>
+            <w:tcW w:w="1201" w:type="dxa"/>
+          </w:tcPr>
+          <w:p>
+            <w:pPr>
+              <w:jc w:val="center"/>
+              <w:rPr>
+                <w:sz w:val="22"/>
+                <w:szCs w:val="22"/>
+                <w:lang w:val="en-US"/>
+              </w:rPr>
+            </w:pPr>
+            <w:r>
+              <w:rPr>
+                <w:rFonts w:hint="cs"/>
+                <w:sz w:val="22"/>
+                <w:szCs w:val="22"/>
+                <w:rtl/>
+                <w:lang w:val="en-US"/>
+              </w:rPr>
+              <w:t>0.02575</w:t>
+            </w:r>
+          </w:p>
+        </w:tc>
+      </w:tr>
+      <w:tr>
+        <w:tc>
+          <w:tcPr>
+            <w:tcW w:w="1659" w:type="dxa"/>
+          </w:tcPr>
+          <w:p>
+            <w:pPr>
+              <w:jc w:val="center"/>
+              <w:rPr>
+                <w:lang w:val="en-US"/>
+              </w:rPr>
+            </w:pPr>
+            <w:r>
+              <w:rPr>
+                <w:lang w:val="en-US"/>
+              </w:rPr>
+              <w:t>Lasso Linear</w:t>
+            </w:r>
+          </w:p>
+        </w:tc>
+        <w:tc>
+          <w:tcPr>
+            <w:tcW w:w="1054" w:type="dxa"/>
+          </w:tcPr>
+          <w:p>
+            <w:pPr>
+              <w:jc w:val="center"/>
+              <w:rPr>
+                <w:lang w:val="en-US"/>
+              </w:rPr>
+            </w:pPr>
+            <w:r>
+              <w:rPr>
+                <w:lang w:val="en-US"/>
+              </w:rPr>
+              <w:t>3</w:t>
+            </w:r>
+          </w:p>
+        </w:tc>
+        <w:tc>
+          <w:tcPr>
+            <w:tcW w:w="2669" w:type="dxa"/>
+          </w:tcPr>
+          <w:p>
+            <w:pPr>
+              <w:jc w:val="center"/>
+              <w:rPr>
+                <w:sz w:val="22"/>
+                <w:szCs w:val="22"/>
+                <w:lang w:val="en-US"/>
+              </w:rPr>
+            </w:pPr>
+            <w:r>
+              <w:rPr>
+                <w:sz w:val="22"/>
+                <w:szCs w:val="22"/>
+                <w:lang w:val="en-US"/>
+              </w:rPr>
+              <w:t>0.022487430212685115</w:t>
+            </w:r>
+          </w:p>
+        </w:tc>
+        <w:tc>
+          <w:tcPr>
+            <w:tcW w:w="2767" w:type="dxa"/>
+          </w:tcPr>
+          <w:p>
+            <w:pPr>
+              <w:jc w:val="center"/>
+              <w:rPr>
+                <w:sz w:val="22"/>
+                <w:szCs w:val="22"/>
+                <w:lang w:val="en-US"/>
+              </w:rPr>
+            </w:pPr>
+            <w:r>
+              <w:rPr>
+                <w:sz w:val="22"/>
+                <w:szCs w:val="22"/>
+                <w:lang w:val="en-US"/>
+              </w:rPr>
+              <w:t>0.02313150258151016</w:t>
+            </w:r>
+          </w:p>
+        </w:tc>
+        <w:tc>
+          <w:tcPr>
+            <w:tcW w:w="1201" w:type="dxa"/>
+          </w:tcPr>
+          <w:p>
+            <w:pPr>
+              <w:jc w:val="center"/>
+              <w:rPr>
+                <w:sz w:val="22"/>
+                <w:szCs w:val="22"/>
+                <w:lang w:val="en-US"/>
+              </w:rPr>
+            </w:pPr>
+            <w:r>
+              <w:rPr>
+                <w:rFonts w:hint="cs"/>
+                <w:sz w:val="22"/>
+                <w:szCs w:val="22"/>
+                <w:rtl/>
+                <w:lang w:val="en-US"/>
+              </w:rPr>
+              <w:t>0.02561</w:t>
+            </w:r>
+          </w:p>
+        </w:tc>
+      </w:tr>
+      <w:tr>
+        <w:tc>
+          <w:tcPr>
+            <w:tcW w:w="1659" w:type="dxa"/>
+          </w:tcPr>
+          <w:p>
+            <w:pPr>
+              <w:jc w:val="center"/>
+              <w:rPr>
+                <w:lang w:val="en-US"/>
+              </w:rPr>
+            </w:pPr>
+            <w:r>
+              <w:rPr>
+                <w:lang w:val="en-US"/>
+              </w:rPr>
+              <w:t>Polynomial Lasso</w:t>
+            </w:r>
+          </w:p>
+        </w:tc>
+        <w:tc>
+          <w:tcPr>
+            <w:tcW w:w="1054" w:type="dxa"/>
+          </w:tcPr>
+          <w:p>
+            <w:pPr>
+              <w:jc w:val="center"/>
+              <w:rPr>
+                <w:lang w:val="en-US"/>
+              </w:rPr>
+            </w:pPr>
+            <w:r>
+              <w:rPr>
+                <w:lang w:val="en-US"/>
+              </w:rPr>
+              <w:t>4</w:t>
+            </w:r>
+          </w:p>
+        </w:tc>
+        <w:tc>
+          <w:tcPr>
+            <w:tcW w:w="2669" w:type="dxa"/>
+          </w:tcPr>
+          <w:p>
+            <w:pPr>
+              <w:jc w:val="center"/>
+              <w:rPr>
+                <w:sz w:val="22"/>
+                <w:szCs w:val="22"/>
+                <w:lang w:val="en-US"/>
+              </w:rPr>
+            </w:pPr>
+            <w:r>
+              <w:rPr>
+                <w:sz w:val="22"/>
+                <w:szCs w:val="22"/>
+                <w:lang w:val="en-US"/>
+              </w:rPr>
+              <w:t>0.01708488188749001</w:t>
+            </w:r>
+          </w:p>
+        </w:tc>
+        <w:tc>
+          <w:tcPr>
+            <w:tcW w:w="2767" w:type="dxa"/>
+          </w:tcPr>
+          <w:p>
+            <w:pPr>
+              <w:jc w:val="center"/>
+              <w:rPr>
+                <w:sz w:val="22"/>
+                <w:szCs w:val="22"/>
+                <w:lang w:val="en-US"/>
+              </w:rPr>
+            </w:pPr>
+            <w:r>
+              <w:rPr>
+                <w:sz w:val="22"/>
+                <w:szCs w:val="22"/>
+                <w:lang w:val="en-US"/>
+              </w:rPr>
+              <w:t>0.01841226323567999</w:t>
+            </w:r>
+          </w:p>
+        </w:tc>
+        <w:tc>
+          <w:tcPr>
+            <w:tcW w:w="1201" w:type="dxa"/>
+          </w:tcPr>
+          <w:p>
+            <w:pPr>
+              <w:bidi/>
+              <w:jc w:val="center"/>
+              <w:rPr>
+                <w:sz w:val="22"/>
+                <w:szCs w:val="22"/>
+                <w:rtl/>
+                <w:lang w:val="en-US"/>
+              </w:rPr>
+            </w:pPr>
+            <w:r>
+              <w:rPr>
+                <w:rFonts w:hint="cs"/>
+                <w:sz w:val="22"/>
+                <w:szCs w:val="22"/>
+                <w:rtl/>
+                <w:lang w:val="en-US"/>
+              </w:rPr>
+              <w:t>0.02779</w:t>
+            </w:r>
+          </w:p>
+        </w:tc>
+      </w:tr>
+      <w:tr>
+        <w:tc>
+          <w:tcPr>
+            <w:tcW w:w="1659" w:type="dxa"/>
+          </w:tcPr>
+          <w:p>
+            <w:pPr>
+              <w:jc w:val="center"/>
+              <w:rPr>
+                <w:lang w:val="en-US"/>
+              </w:rPr>
+            </w:pPr>
+            <w:r>
+              <w:rPr>
+                <w:lang w:val="en-US"/>
+              </w:rPr>
+              <w:t>GBM Regressor</w:t>
+            </w:r>
+          </w:p>
+        </w:tc>
+        <w:tc>
+          <w:tcPr>
+            <w:tcW w:w="1054" w:type="dxa"/>
+          </w:tcPr>
+          <w:p>
+            <w:pPr>
+              <w:jc w:val="center"/>
+              <w:rPr>
+                <w:lang w:val="en-US"/>
+              </w:rPr>
+            </w:pPr>
+            <w:r>
+              <w:rPr>
+                <w:lang w:val="en-US"/>
+              </w:rPr>
+              <w:t>5</w:t>
+            </w:r>
+          </w:p>
+        </w:tc>
+        <w:tc>
+          <w:tcPr>
+            <w:tcW w:w="2669" w:type="dxa"/>
+          </w:tcPr>
+          <w:p>
+            <w:pPr>
+              <w:jc w:val="center"/>
+              <w:rPr>
+                <w:sz w:val="22"/>
+                <w:szCs w:val="22"/>
+                <w:lang w:val="en-US"/>
+              </w:rPr>
+            </w:pPr>
+            <w:r>
+              <w:rPr>
+                <w:sz w:val="22"/>
+                <w:szCs w:val="22"/>
+                <w:lang w:val="en-US"/>
+              </w:rPr>
+              <w:t>0.0015133026206487735</w:t>
+            </w:r>
+          </w:p>
+        </w:tc>
+        <w:tc>
+          <w:tcPr>
+            <w:tcW w:w="2767" w:type="dxa"/>
+          </w:tcPr>
+          <w:p>
+            <w:pPr>
+              <w:jc w:val="center"/>
+              <w:rPr>
+                <w:sz w:val="22"/>
+                <w:szCs w:val="22"/>
+                <w:lang w:val="en-US"/>
+              </w:rPr>
+            </w:pPr>
+            <w:r>
+              <w:rPr>
+                <w:sz w:val="22"/>
+                <w:szCs w:val="22"/>
+                <w:lang w:val="en-US"/>
+              </w:rPr>
+              <w:t>0.0010523804993928887</w:t>
+            </w:r>
+          </w:p>
+        </w:tc>
+        <w:tc>
+          <w:tcPr>
+            <w:tcW w:w="1201" w:type="dxa"/>
+          </w:tcPr>
+          <w:p>
+            <w:pPr>
+              <w:jc w:val="center"/>
+              <w:rPr>
+                <w:sz w:val="22"/>
+                <w:szCs w:val="22"/>
+                <w:lang w:val="en-US"/>
+              </w:rPr>
+            </w:pPr>
+            <w:r>
+              <w:rPr>
+                <w:rFonts w:hint="cs"/>
+                <w:sz w:val="22"/>
+                <w:szCs w:val="22"/>
+                <w:rtl/>
+                <w:lang w:val="en-US"/>
+              </w:rPr>
+              <w:t>0.00099</w:t>
+            </w:r>
+          </w:p>
+        </w:tc>
+      </w:tr>
+    </w:tbl>
+    <w:p>
+      <w:pPr>
+        <w:rPr>
+          <w:color w:val="215E99" w:themeColor="text2" w:themeTint="BF"/>
+          <w:rtl/>
+          <w:lang w:val="en-US"/>
+        </w:rPr>
+      </w:pPr>
+    </w:p>
+    <w:p>
+      <w:pPr>
+        <w:pStyle w:val="ListParagraph"/>
+        <w:numPr>
+          <w:ilvl w:val="0"/>
+          <w:numId w:val="1"/>
+        </w:numPr>
+        <w:rPr>
+          <w:color w:val="215E99" w:themeColor="text2" w:themeTint="BF"/>
+          <w:lang w:val="en-US"/>
+        </w:rPr>
+      </w:pPr>
+      <w:r>
+        <w:rPr>
+          <w:color w:val="215E99" w:themeColor="text2" w:themeTint="BF"/>
+          <w:lang w:val="en-US"/>
+        </w:rPr>
+        <w:t xml:space="preserve">The model that performed best on the test set is the GBM Regressor model with </w:t>
+      </w:r>
+      <w:proofErr w:type="gramStart"/>
+      <w:r>
+        <w:rPr>
+          <w:color w:val="215E99" w:themeColor="text2" w:themeTint="BF"/>
+          <w:lang w:val="en-US"/>
+        </w:rPr>
+        <w:t>loss</w:t>
+      </w:r>
+      <w:proofErr w:type="gramEnd"/>
+      <w:r>
+        <w:rPr>
+          <w:color w:val="215E99" w:themeColor="text2" w:themeTint="BF"/>
+          <w:lang w:val="en-US"/>
+        </w:rPr>
+        <w:t xml:space="preserve"> of 0.00099.</w:t>
+      </w:r>
+    </w:p>
+    <w:p>
+      <w:pPr>
+        <w:pStyle w:val="ListParagraph"/>
+        <w:numPr>
+          <w:ilvl w:val="0"/>
+          <w:numId w:val="1"/>
+        </w:numPr>
+        <w:rPr>
+          <w:color w:val="215E99" w:themeColor="text2" w:themeTint="BF"/>
+        </w:rPr>
+      </w:pPr>
+      <w:r>
+        <w:rPr>
+          <w:color w:val="215E99" w:themeColor="text2" w:themeTint="BF"/>
+          <w:lang w:val="en-US"/>
+        </w:rPr>
+        <w:t xml:space="preserve">The Dummy model </w:t>
+      </w:r>
+      <w:r>
+        <w:rPr>
+          <w:color w:val="215E99" w:themeColor="text2" w:themeTint="BF"/>
+          <w:lang w:val="en-US"/>
+        </w:rPr>
+        <w:t xml:space="preserve">has the worst performance of all the 5 models. It </w:t>
+      </w:r>
+      <w:proofErr w:type="gramStart"/>
+      <w:r>
+        <w:rPr>
+          <w:color w:val="215E99" w:themeColor="text2" w:themeTint="BF"/>
+        </w:rPr>
+        <w:t>underfits</w:t>
+      </w:r>
+      <w:proofErr w:type="gramEnd"/>
+      <w:r>
+        <w:rPr>
+          <w:color w:val="215E99" w:themeColor="text2" w:themeTint="BF"/>
+        </w:rPr>
+        <w:t xml:space="preserve"> the data</w:t>
+      </w:r>
+      <w:r>
+        <w:rPr>
+          <w:color w:val="215E99" w:themeColor="text2" w:themeTint="BF"/>
+        </w:rPr>
+        <w:t>, because it is too simple to capture the underlying data patterns.</w:t>
+      </w:r>
+    </w:p>
+    <w:p>
+      <w:pPr>
+        <w:pStyle w:val="ListParagraph"/>
+        <w:numPr>
+          <w:ilvl w:val="0"/>
+          <w:numId w:val="1"/>
+        </w:numPr>
+        <w:rPr>
+          <w:color w:val="215E99" w:themeColor="text2" w:themeTint="BF"/>
+          <w:rtl/>
+          <w:lang w:val="en-US"/>
+        </w:rPr>
+      </w:pPr>
+      <w:r>
+        <w:rPr>
+          <w:color w:val="215E99" w:themeColor="text2" w:themeTint="BF"/>
+        </w:rPr>
+        <w:t>Both Lasso Linear and Linear models show similar performance in training and validation. They</w:t>
+      </w:r>
+      <w:r>
+        <w:rPr>
+          <w:color w:val="215E99" w:themeColor="text2" w:themeTint="BF"/>
+        </w:rPr>
+        <w:t xml:space="preserve"> </w:t>
+      </w:r>
+      <w:r>
+        <w:rPr>
+          <w:color w:val="215E99" w:themeColor="text2" w:themeTint="BF"/>
+        </w:rPr>
+        <w:t>don’t seem to have</w:t>
+      </w:r>
+      <w:r>
+        <w:rPr>
+          <w:color w:val="215E99" w:themeColor="text2" w:themeTint="BF"/>
+        </w:rPr>
+        <w:t xml:space="preserve"> </w:t>
+      </w:r>
+      <w:r>
+        <w:rPr>
+          <w:color w:val="215E99" w:themeColor="text2" w:themeTint="BF"/>
+        </w:rPr>
+        <w:t>directed</w:t>
+      </w:r>
+      <w:r>
+        <w:rPr>
+          <w:color w:val="215E99" w:themeColor="text2" w:themeTint="BF"/>
+        </w:rPr>
+        <w:t xml:space="preserve"> signs of overfitting or underfitting.</w:t>
+      </w:r>
+      <w:r>
+        <w:rPr>
+          <w:color w:val="215E99" w:themeColor="text2" w:themeTint="BF"/>
+        </w:rPr>
+        <w:t xml:space="preserve"> Since training and validation accuracies are similar and not bad.</w:t>
+      </w:r>
+    </w:p>
+    <w:p>
+      <w:pPr>
+        <w:pStyle w:val="ListParagraph"/>
+        <w:numPr>
+          <w:ilvl w:val="0"/>
+          <w:numId w:val="1"/>
+        </w:numPr>
+        <w:rPr>
+          <w:color w:val="215E99" w:themeColor="text2" w:themeTint="BF"/>
+        </w:rPr>
+      </w:pPr>
+      <w:r>
+        <w:rPr>
+          <w:color w:val="215E99" w:themeColor="text2" w:themeTint="BF"/>
+        </w:rPr>
+        <w:t xml:space="preserve">The </w:t>
+      </w:r>
+      <w:proofErr w:type="spellStart"/>
+      <w:r>
+        <w:rPr>
+          <w:color w:val="215E99" w:themeColor="text2" w:themeTint="BF"/>
+        </w:rPr>
+        <w:t>Polinomial</w:t>
+      </w:r>
+      <w:proofErr w:type="spellEnd"/>
+      <w:r>
+        <w:rPr>
+          <w:color w:val="215E99" w:themeColor="text2" w:themeTint="BF"/>
+        </w:rPr>
+        <w:t xml:space="preserve"> Regressor model has lower Train and Valid MSE, than the 2 previous models. However, the ‘Test MSE</w:t>
+      </w:r>
+      <w:proofErr w:type="gramStart"/>
+      <w:r>
+        <w:rPr>
+          <w:color w:val="215E99" w:themeColor="text2" w:themeTint="BF"/>
+        </w:rPr>
+        <w:t>’  is</w:t>
+      </w:r>
+      <w:proofErr w:type="gramEnd"/>
+      <w:r>
+        <w:rPr>
+          <w:color w:val="215E99" w:themeColor="text2" w:themeTint="BF"/>
+        </w:rPr>
+        <w:t xml:space="preserve"> higher than the Linear and Lasso models, so it can mean that the model may be overfitting the training data.</w:t>
+      </w:r>
+    </w:p>
+    <w:p>
+      <w:pPr>
+        <w:pStyle w:val="ListParagraph"/>
+        <w:numPr>
+          <w:ilvl w:val="0"/>
+          <w:numId w:val="1"/>
+        </w:numPr>
+        <w:rPr>
+          <w:color w:val="215E99" w:themeColor="text2" w:themeTint="BF"/>
+          <w:lang w:val="en-US"/>
+        </w:rPr>
+      </w:pPr>
+      <w:r>
+        <w:rPr>
+          <w:color w:val="215E99" w:themeColor="text2" w:themeTint="BF"/>
+        </w:rPr>
+        <w:t xml:space="preserve">The </w:t>
+      </w:r>
+      <w:r>
+        <w:rPr>
+          <w:color w:val="215E99" w:themeColor="text2" w:themeTint="BF"/>
+          <w:lang w:val="en-US"/>
+        </w:rPr>
+        <w:t>GBM Regressor</w:t>
+      </w:r>
+      <w:r>
+        <w:rPr>
+          <w:color w:val="215E99" w:themeColor="text2" w:themeTint="BF"/>
+        </w:rPr>
+        <w:t xml:space="preserve"> is the best of the 5 models, in the </w:t>
+      </w:r>
+      <w:r>
+        <w:rPr>
+          <w:color w:val="215E99" w:themeColor="text2" w:themeTint="BF"/>
+        </w:rPr>
+        <w:t xml:space="preserve">Train, Valid and Test </w:t>
+      </w:r>
+      <w:proofErr w:type="spellStart"/>
+      <w:r>
+        <w:rPr>
+          <w:color w:val="215E99" w:themeColor="text2" w:themeTint="BF"/>
+        </w:rPr>
+        <w:t>MSE’s</w:t>
+      </w:r>
+      <w:proofErr w:type="spellEnd"/>
+      <w:r>
+        <w:rPr>
+          <w:color w:val="215E99" w:themeColor="text2" w:themeTint="BF"/>
+        </w:rPr>
+        <w:t xml:space="preserve">. </w:t>
+      </w:r>
+      <w:r>
+        <w:rPr>
+          <w:color w:val="215E99" w:themeColor="text2" w:themeTint="BF"/>
+        </w:rPr>
+        <w:t xml:space="preserve">It means that this model is good </w:t>
+      </w:r>
+      <w:r>
+        <w:rPr>
+          <w:color w:val="215E99" w:themeColor="text2" w:themeTint="BF"/>
+        </w:rPr>
+        <w:t xml:space="preserve">and </w:t>
+      </w:r>
+      <w:proofErr w:type="gramStart"/>
+      <w:r>
+        <w:rPr>
+          <w:color w:val="215E99" w:themeColor="text2" w:themeTint="BF"/>
+        </w:rPr>
+        <w:t>it</w:t>
+      </w:r>
+      <w:proofErr w:type="gramEnd"/>
+      <w:r>
+        <w:rPr>
+          <w:color w:val="215E99" w:themeColor="text2" w:themeTint="BF"/>
+        </w:rPr>
+        <w:t xml:space="preserve"> success to generalizes very well to new data, by </w:t>
+      </w:r>
+      <w:r>
+        <w:rPr>
+          <w:color w:val="215E99" w:themeColor="text2" w:themeTint="BF"/>
+        </w:rPr>
+        <w:t xml:space="preserve">capturing the patterns </w:t>
+      </w:r>
+      <w:r>
+        <w:rPr>
+          <w:color w:val="215E99" w:themeColor="text2" w:themeTint="BF"/>
+        </w:rPr>
+        <w:t>of</w:t>
+      </w:r>
+      <w:r>
+        <w:rPr>
+          <w:color w:val="215E99" w:themeColor="text2" w:themeTint="BF"/>
+        </w:rPr>
+        <w:t xml:space="preserve"> the training data.</w:t>
+      </w:r>
+      <w:r>
+        <w:rPr>
+          <w:color w:val="215E99" w:themeColor="text2" w:themeTint="BF"/>
+          <w:lang w:val="en-US"/>
+        </w:rPr>
+        <w:t xml:space="preserve"> That is since all </w:t>
+      </w:r>
+      <w:proofErr w:type="gramStart"/>
+      <w:r>
+        <w:rPr>
+          <w:color w:val="215E99" w:themeColor="text2" w:themeTint="BF"/>
+          <w:lang w:val="en-US"/>
+        </w:rPr>
+        <w:t>train ,validation</w:t>
+      </w:r>
+      <w:proofErr w:type="gramEnd"/>
+      <w:r>
+        <w:rPr>
+          <w:color w:val="215E99" w:themeColor="text2" w:themeTint="BF"/>
+          <w:lang w:val="en-US"/>
+        </w:rPr>
+        <w:t xml:space="preserve"> and test accuracies are good and similar.</w:t>
+      </w:r>
+    </w:p>
     <w:sectPr>
       <w:pgSz w:w="12240" w:h="15840"/>
       <w:pgMar w:top="1440" w:right="1440" w:bottom="955" w:left="1440" w:header="708" w:footer="708" w:gutter="0"/>
@@ -4180,6 +7155,126 @@
     </w:sectPr>
   </w:body>
 </w:document>
+</file>
+
+<file path=word/numbering.xml><?xml version="1.0" encoding="utf-8"?>
+<w:numbering xmlns:wpc="http://schemas.microsoft.com/office/word/2010/wordprocessingCanvas" xmlns:cx="http://schemas.microsoft.com/office/drawing/2014/chartex" xmlns:cx1="http://schemas.microsoft.com/office/drawing/2015/9/8/chartex" xmlns:cx2="http://schemas.microsoft.com/office/drawing/2015/10/21/chartex" xmlns:cx3="http://schemas.microsoft.com/office/drawing/2016/5/9/chartex" xmlns:cx4="http://schemas.microsoft.com/office/drawing/2016/5/10/chartex" xmlns:cx5="http://schemas.microsoft.com/office/drawing/2016/5/11/chartex" xmlns:cx6="http://schemas.microsoft.com/office/drawing/2016/5/12/chartex" xmlns:cx7="http://schemas.microsoft.com/office/drawing/2016/5/13/chartex" xmlns:cx8="http://schemas.microsoft.com/office/drawing/2016/5/14/chartex" xmlns:mc="http://schemas.openxmlformats.org/markup-compatibility/2006" xmlns:aink="http://schemas.microsoft.com/office/drawing/2016/ink" xmlns:am3d="http://schemas.microsoft.com/office/drawing/2017/model3d" xmlns:o="urn:schemas-microsoft-com:office:office" xmlns:oel="http://schemas.microsoft.com/office/2019/extlst" xmlns:r="http://schemas.openxmlformats.org/officeDocument/2006/relationships" xmlns:m="http://schemas.openxmlformats.org/officeDocument/2006/math" xmlns:v="urn:schemas-microsoft-com:vml" xmlns:wp14="http://schemas.microsoft.com/office/word/2010/wordprocessingDrawing" xmlns:wp="http://schemas.openxmlformats.org/drawingml/2006/wordprocessingDrawing" xmlns:w10="urn:schemas-microsoft-com:office:word" xmlns:w="http://schemas.openxmlformats.org/wordprocessingml/2006/main" xmlns:w14="http://schemas.microsoft.com/office/word/2010/wordml" xmlns:w15="http://schemas.microsoft.com/office/word/2012/wordml" xmlns:w16cex="http://schemas.microsoft.com/office/word/2018/wordml/cex" xmlns:w16cid="http://schemas.microsoft.com/office/word/2016/wordml/cid" xmlns:w16="http://schemas.microsoft.com/office/word/2018/wordml" xmlns:w16du="http://schemas.microsoft.com/office/word/2023/wordml/word16du" xmlns:w16sdtdh="http://schemas.microsoft.com/office/word/2020/wordml/sdtdatahash" xmlns:w16se="http://schemas.microsoft.com/office/word/2015/wordml/symex" xmlns:wpg="http://schemas.microsoft.com/office/word/2010/wordprocessingGroup" xmlns:wpi="http://schemas.microsoft.com/office/word/2010/wordprocessingInk" xmlns:wne="http://schemas.microsoft.com/office/word/2006/wordml" xmlns:wps="http://schemas.microsoft.com/office/word/2010/wordprocessingShape" mc:Ignorable="w14 w15 w16se w16cid w16 w16cex w16sdtdh w16du wp14">
+  <w:abstractNum w:abstractNumId="0" w15:restartNumberingAfterBreak="0">
+    <w:nsid w:val="5FD11FCD"/>
+    <w:multiLevelType w:val="hybridMultilevel"/>
+    <w:tmpl w:val="F028F28C"/>
+    <w:lvl w:ilvl="0" w:tplc="7C262954">
+      <w:numFmt w:val="bullet"/>
+      <w:lvlText w:val="-"/>
+      <w:lvlJc w:val="left"/>
+      <w:pPr>
+        <w:ind w:left="720" w:hanging="360"/>
+      </w:pPr>
+      <w:rPr>
+        <w:rFonts w:ascii="Aptos" w:eastAsiaTheme="minorHAnsi" w:hAnsi="Aptos" w:cstheme="minorBidi" w:hint="default"/>
+      </w:rPr>
+    </w:lvl>
+    <w:lvl w:ilvl="1" w:tplc="20000003" w:tentative="1">
+      <w:start w:val="1"/>
+      <w:numFmt w:val="bullet"/>
+      <w:lvlText w:val="o"/>
+      <w:lvlJc w:val="left"/>
+      <w:pPr>
+        <w:ind w:left="1440" w:hanging="360"/>
+      </w:pPr>
+      <w:rPr>
+        <w:rFonts w:ascii="Courier New" w:hAnsi="Courier New" w:cs="Courier New" w:hint="default"/>
+      </w:rPr>
+    </w:lvl>
+    <w:lvl w:ilvl="2" w:tplc="20000005" w:tentative="1">
+      <w:start w:val="1"/>
+      <w:numFmt w:val="bullet"/>
+      <w:lvlText w:val=""/>
+      <w:lvlJc w:val="left"/>
+      <w:pPr>
+        <w:ind w:left="2160" w:hanging="360"/>
+      </w:pPr>
+      <w:rPr>
+        <w:rFonts w:ascii="Wingdings" w:hAnsi="Wingdings" w:hint="default"/>
+      </w:rPr>
+    </w:lvl>
+    <w:lvl w:ilvl="3" w:tplc="20000001" w:tentative="1">
+      <w:start w:val="1"/>
+      <w:numFmt w:val="bullet"/>
+      <w:lvlText w:val=""/>
+      <w:lvlJc w:val="left"/>
+      <w:pPr>
+        <w:ind w:left="2880" w:hanging="360"/>
+      </w:pPr>
+      <w:rPr>
+        <w:rFonts w:ascii="Symbol" w:hAnsi="Symbol" w:hint="default"/>
+      </w:rPr>
+    </w:lvl>
+    <w:lvl w:ilvl="4" w:tplc="20000003" w:tentative="1">
+      <w:start w:val="1"/>
+      <w:numFmt w:val="bullet"/>
+      <w:lvlText w:val="o"/>
+      <w:lvlJc w:val="left"/>
+      <w:pPr>
+        <w:ind w:left="3600" w:hanging="360"/>
+      </w:pPr>
+      <w:rPr>
+        <w:rFonts w:ascii="Courier New" w:hAnsi="Courier New" w:cs="Courier New" w:hint="default"/>
+      </w:rPr>
+    </w:lvl>
+    <w:lvl w:ilvl="5" w:tplc="20000005" w:tentative="1">
+      <w:start w:val="1"/>
+      <w:numFmt w:val="bullet"/>
+      <w:lvlText w:val=""/>
+      <w:lvlJc w:val="left"/>
+      <w:pPr>
+        <w:ind w:left="4320" w:hanging="360"/>
+      </w:pPr>
+      <w:rPr>
+        <w:rFonts w:ascii="Wingdings" w:hAnsi="Wingdings" w:hint="default"/>
+      </w:rPr>
+    </w:lvl>
+    <w:lvl w:ilvl="6" w:tplc="20000001" w:tentative="1">
+      <w:start w:val="1"/>
+      <w:numFmt w:val="bullet"/>
+      <w:lvlText w:val=""/>
+      <w:lvlJc w:val="left"/>
+      <w:pPr>
+        <w:ind w:left="5040" w:hanging="360"/>
+      </w:pPr>
+      <w:rPr>
+        <w:rFonts w:ascii="Symbol" w:hAnsi="Symbol" w:hint="default"/>
+      </w:rPr>
+    </w:lvl>
+    <w:lvl w:ilvl="7" w:tplc="20000003" w:tentative="1">
+      <w:start w:val="1"/>
+      <w:numFmt w:val="bullet"/>
+      <w:lvlText w:val="o"/>
+      <w:lvlJc w:val="left"/>
+      <w:pPr>
+        <w:ind w:left="5760" w:hanging="360"/>
+      </w:pPr>
+      <w:rPr>
+        <w:rFonts w:ascii="Courier New" w:hAnsi="Courier New" w:cs="Courier New" w:hint="default"/>
+      </w:rPr>
+    </w:lvl>
+    <w:lvl w:ilvl="8" w:tplc="20000005" w:tentative="1">
+      <w:start w:val="1"/>
+      <w:numFmt w:val="bullet"/>
+      <w:lvlText w:val=""/>
+      <w:lvlJc w:val="left"/>
+      <w:pPr>
+        <w:ind w:left="6480" w:hanging="360"/>
+      </w:pPr>
+      <w:rPr>
+        <w:rFonts w:ascii="Wingdings" w:hAnsi="Wingdings" w:hint="default"/>
+      </w:rPr>
+    </w:lvl>
+  </w:abstractNum>
+  <w:num w:numId="1" w16cid:durableId="452402085">
+    <w:abstractNumId w:val="0"/>
+  </w:num>
+</w:numbering>
 </file>
 
 <file path=word/styles.xml><?xml version="1.0" encoding="utf-8"?>
@@ -5128,6 +8223,17 @@
       </w:tblBorders>
     </w:tblPr>
   </w:style>
+  <w:style w:type="character" w:styleId="Strong">
+    <w:name w:val="Strong"/>
+    <w:basedOn w:val="DefaultParagraphFont"/>
+    <w:uiPriority w:val="22"/>
+    <w:qFormat/>
+    <w:rsid w:val="00BE1974"/>
+    <w:rPr>
+      <w:b/>
+      <w:bCs/>
+    </w:rPr>
+  </w:style>
 </w:styles>
 </file>
 

</xml_diff>

<commit_message>
Corrected queation 15 plot and Dry accordingly
</commit_message>
<xml_diff>
--- a/HW3_WET/ML Major 3.docx
+++ b/HW3_WET/ML Major 3.docx
@@ -1157,7 +1157,7 @@
         </w:rPr>
         <w:lastRenderedPageBreak/>
         <w:drawing>
-          <wp:anchor distT="0" distB="0" distL="114300" distR="114300" simplePos="0" relativeHeight="251658240" behindDoc="0" locked="0" layoutInCell="1" allowOverlap="1" wp14:anchorId="2039C517" wp14:editId="459EA16A">
+          <wp:anchor distT="0" distB="0" distL="114300" distR="114300" simplePos="0" relativeHeight="251658240" behindDoc="0" locked="0" layoutInCell="1" allowOverlap="1" wp14:anchorId="2039C517" wp14:editId="246D5B55">
             <wp:simplePos x="0" y="0"/>
             <wp:positionH relativeFrom="column">
               <wp:posOffset>-452755</wp:posOffset>
@@ -1774,7 +1774,7 @@
                 <w:szCs w:val="22"/>
                 <w:lang w:val="en-US"/>
               </w:rPr>
-              <w:t>-0.06624823283856855</w:t>
+              <w:t>0.06624823283856855</w:t>
             </w:r>
           </w:p>
         </w:tc>
@@ -1797,7 +1797,7 @@
                 <w:szCs w:val="22"/>
                 <w:lang w:val="en-US"/>
               </w:rPr>
-              <w:t>-0.06655387736460414</w:t>
+              <w:t>0.06655387736460414</w:t>
             </w:r>
           </w:p>
         </w:tc>
@@ -2183,7 +2183,7 @@
                 <w:szCs w:val="22"/>
                 <w:lang w:val="en-US"/>
               </w:rPr>
-              <w:t>-0.06624823283856855</w:t>
+              <w:t>0.06624823283856855</w:t>
             </w:r>
           </w:p>
         </w:tc>
@@ -2206,7 +2206,7 @@
                 <w:szCs w:val="22"/>
                 <w:lang w:val="en-US"/>
               </w:rPr>
-              <w:t>-0.06655387736460414</w:t>
+              <w:t>0.06655387736460414</w:t>
             </w:r>
           </w:p>
         </w:tc>
@@ -2966,7 +2966,7 @@
                 <w:szCs w:val="22"/>
                 <w:lang w:val="en-US"/>
               </w:rPr>
-              <w:t>-0.06624823283856855</w:t>
+              <w:t>0.06624823283856855</w:t>
             </w:r>
           </w:p>
         </w:tc>
@@ -2989,7 +2989,7 @@
                 <w:szCs w:val="22"/>
                 <w:lang w:val="en-US"/>
               </w:rPr>
-              <w:t>-0.06655387736460414</w:t>
+              <w:t>0.06655387736460414</w:t>
             </w:r>
           </w:p>
         </w:tc>
@@ -3762,7 +3762,40 @@
         <w:rPr>
           <w:color w:val="156082" w:themeColor="accent1"/>
         </w:rPr>
-        <w:t xml:space="preserve">Larger, less important variables might not have their coefficients reduced to zero due to their scale, while more important </w:t>
+        <w:t>Larger</w:t>
+      </w:r>
+      <w:r>
+        <w:rPr>
+          <w:rFonts w:hint="cs"/>
+          <w:color w:val="156082" w:themeColor="accent1"/>
+          <w:rtl/>
+        </w:rPr>
+        <w:t xml:space="preserve"> </w:t>
+      </w:r>
+      <w:r>
+        <w:rPr>
+          <w:color w:val="156082" w:themeColor="accent1"/>
+          <w:lang w:val="en-US"/>
+        </w:rPr>
+        <w:t>scaled</w:t>
+      </w:r>
+      <w:r>
+        <w:rPr>
+          <w:color w:val="156082" w:themeColor="accent1"/>
+        </w:rPr>
+        <w:t xml:space="preserve">, less important </w:t>
+      </w:r>
+      <w:r>
+        <w:rPr>
+          <w:color w:val="156082" w:themeColor="accent1"/>
+        </w:rPr>
+        <w:t>features</w:t>
+      </w:r>
+      <w:r>
+        <w:rPr>
+          <w:color w:val="156082" w:themeColor="accent1"/>
+        </w:rPr>
+        <w:t xml:space="preserve"> might not have their coefficients reduced to zero due to their scale, while more important </w:t>
       </w:r>
       <w:proofErr w:type="gramStart"/>
       <w:r>
@@ -3881,7 +3914,19 @@
         <w:rPr>
           <w:color w:val="156082" w:themeColor="accent1"/>
         </w:rPr>
-        <w:t>by feature scale. As a result, features with larger scales might be under-penalized, and those with smaller scales might be over-penalized. This imbalance can lead to retaining less relevant features and discarding important ones, ultimately skewing the model’s results and hurting its performance.</w:t>
+        <w:t>by feature scale. As a result, features with larger scales might be under</w:t>
+      </w:r>
+      <w:r>
+        <w:rPr>
+          <w:color w:val="156082" w:themeColor="accent1"/>
+        </w:rPr>
+        <w:t xml:space="preserve"> </w:t>
+      </w:r>
+      <w:r>
+        <w:rPr>
+          <w:color w:val="156082" w:themeColor="accent1"/>
+        </w:rPr>
+        <w:t>penalized, and those with smaller scales might be over-penalized. This imbalance can lead to retaining less relevant features and discarding important ones, ultimately skewing the model’s results and hurting its performance.</w:t>
       </w:r>
     </w:p>
     <w:p>
@@ -3988,32 +4033,68 @@
     <w:p>
       <w:pPr>
         <w:rPr>
-          <w:color w:val="156082" w:themeColor="accent1"/>
-          <w:lang w:val="en-US"/>
-        </w:rPr>
-      </w:pPr>
-      <w:r>
-        <w:rPr>
-          <w:color w:val="156082" w:themeColor="accent1"/>
-          <w:lang w:val="en-US"/>
-        </w:rPr>
-        <w:t xml:space="preserve">We can argue that the ridge model here is more </w:t>
-      </w:r>
-      <w:proofErr w:type="spellStart"/>
-      <w:r>
-        <w:rPr>
-          <w:color w:val="156082" w:themeColor="accent1"/>
-          <w:lang w:val="en-US"/>
-        </w:rPr>
-        <w:t>non_normalization</w:t>
-      </w:r>
-      <w:proofErr w:type="spellEnd"/>
-      <w:r>
-        <w:rPr>
-          <w:color w:val="156082" w:themeColor="accent1"/>
-          <w:lang w:val="en-US"/>
-        </w:rPr>
-        <w:t xml:space="preserve"> proof here since it tends to zero out less coefficients inherently.</w:t>
+          <w:lang w:val="en-US"/>
+        </w:rPr>
+      </w:pPr>
+      <w:r>
+        <w:rPr>
+          <w:color w:val="156082" w:themeColor="accent1"/>
+        </w:rPr>
+        <w:t>The ridge model is less sensitive to the effects of no</w:t>
+      </w:r>
+      <w:r>
+        <w:rPr>
+          <w:color w:val="156082" w:themeColor="accent1"/>
+        </w:rPr>
+        <w:t xml:space="preserve">t </w:t>
+      </w:r>
+      <w:r>
+        <w:rPr>
+          <w:color w:val="156082" w:themeColor="accent1"/>
+        </w:rPr>
+        <w:t>normaliz</w:t>
+      </w:r>
+      <w:r>
+        <w:rPr>
+          <w:color w:val="156082" w:themeColor="accent1"/>
+        </w:rPr>
+        <w:t>ing features</w:t>
+      </w:r>
+      <w:r>
+        <w:rPr>
+          <w:color w:val="156082" w:themeColor="accent1"/>
+        </w:rPr>
+        <w:t xml:space="preserve"> </w:t>
+      </w:r>
+      <w:r>
+        <w:rPr>
+          <w:color w:val="156082" w:themeColor="accent1"/>
+        </w:rPr>
+        <w:t>since</w:t>
+      </w:r>
+      <w:r>
+        <w:rPr>
+          <w:color w:val="156082" w:themeColor="accent1"/>
+        </w:rPr>
+        <w:t xml:space="preserve"> it tends to shrink coefficients rather than </w:t>
+      </w:r>
+      <w:r>
+        <w:rPr>
+          <w:color w:val="156082" w:themeColor="accent1"/>
+        </w:rPr>
+        <w:t>zeroing them out</w:t>
+      </w:r>
+      <w:r>
+        <w:rPr>
+          <w:color w:val="156082" w:themeColor="accent1"/>
+        </w:rPr>
+        <w:t>. This makes it more stable when features are not normalized</w:t>
+      </w:r>
+      <w:r>
+        <w:rPr>
+          <w:color w:val="156082" w:themeColor="accent1"/>
+        </w:rPr>
+        <w:t xml:space="preserve"> compared to the lasso model.</w:t>
       </w:r>
     </w:p>
     <w:p>
@@ -4217,14 +4298,13 @@
       </w:pPr>
       <w:r>
         <w:rPr>
-          <w:noProof/>
           <w:lang w:val="en-US"/>
         </w:rPr>
         <w:drawing>
-          <wp:inline distT="0" distB="0" distL="0" distR="0" wp14:anchorId="7A5AC750" wp14:editId="02CFAACD">
-            <wp:extent cx="3016188" cy="2382982"/>
-            <wp:effectExtent l="0" t="0" r="0" b="5080"/>
-            <wp:docPr id="2140821314" name="Picture 1"/>
+          <wp:inline distT="0" distB="0" distL="0" distR="0" wp14:anchorId="038B1AFD" wp14:editId="3235F1DF">
+            <wp:extent cx="4206240" cy="3259836"/>
+            <wp:effectExtent l="0" t="0" r="3810" b="0"/>
+            <wp:docPr id="853876368" name="Picture 1"/>
             <wp:cNvGraphicFramePr>
               <a:graphicFrameLocks xmlns:a="http://schemas.openxmlformats.org/drawingml/2006/main" noChangeAspect="1"/>
             </wp:cNvGraphicFramePr>
@@ -4232,7 +4312,7 @@
               <a:graphicData uri="http://schemas.openxmlformats.org/drawingml/2006/picture">
                 <pic:pic xmlns:pic="http://schemas.openxmlformats.org/drawingml/2006/picture">
                   <pic:nvPicPr>
-                    <pic:cNvPr id="2140821314" name=""/>
+                    <pic:cNvPr id="853876368" name=""/>
                     <pic:cNvPicPr/>
                   </pic:nvPicPr>
                   <pic:blipFill>
@@ -4244,7 +4324,7 @@
                   <pic:spPr>
                     <a:xfrm>
                       <a:off x="0" y="0"/>
-                      <a:ext cx="3034441" cy="2397403"/>
+                      <a:ext cx="4210628" cy="3263236"/>
                     </a:xfrm>
                     <a:prstGeom prst="rect">
                       <a:avLst/>
@@ -4266,14 +4346,13 @@
       </w:pPr>
       <w:r>
         <w:rPr>
-          <w:noProof/>
           <w:lang w:val="en-US"/>
         </w:rPr>
         <w:drawing>
-          <wp:inline distT="0" distB="0" distL="0" distR="0" wp14:anchorId="4465B54F" wp14:editId="4AB3C366">
-            <wp:extent cx="4396740" cy="563332"/>
-            <wp:effectExtent l="0" t="0" r="3810" b="8255"/>
-            <wp:docPr id="1506532396" name="Picture 1" descr="A black background with white text&#10;&#10;Description automatically generated"/>
+          <wp:inline distT="0" distB="0" distL="0" distR="0" wp14:anchorId="22648AF1" wp14:editId="777675A9">
+            <wp:extent cx="5067300" cy="548416"/>
+            <wp:effectExtent l="0" t="0" r="0" b="4445"/>
+            <wp:docPr id="224058450" name="Picture 1" descr="A black background with white text&#10;&#10;Description automatically generated"/>
             <wp:cNvGraphicFramePr>
               <a:graphicFrameLocks xmlns:a="http://schemas.openxmlformats.org/drawingml/2006/main" noChangeAspect="1"/>
             </wp:cNvGraphicFramePr>
@@ -4281,7 +4360,7 @@
               <a:graphicData uri="http://schemas.openxmlformats.org/drawingml/2006/picture">
                 <pic:pic xmlns:pic="http://schemas.openxmlformats.org/drawingml/2006/picture">
                   <pic:nvPicPr>
-                    <pic:cNvPr id="1506532396" name="Picture 1" descr="A black background with white text&#10;&#10;Description automatically generated"/>
+                    <pic:cNvPr id="224058450" name="Picture 1" descr="A black background with white text&#10;&#10;Description automatically generated"/>
                     <pic:cNvPicPr/>
                   </pic:nvPicPr>
                   <pic:blipFill>
@@ -4293,7 +4372,7 @@
                   <pic:spPr>
                     <a:xfrm>
                       <a:off x="0" y="0"/>
-                      <a:ext cx="4445325" cy="569557"/>
+                      <a:ext cx="5100533" cy="552013"/>
                     </a:xfrm>
                     <a:prstGeom prst="rect">
                       <a:avLst/>
@@ -4305,20 +4384,6 @@
           </wp:inline>
         </w:drawing>
       </w:r>
-    </w:p>
-    <w:p>
-      <w:pPr>
-        <w:rPr>
-          <w:lang w:val="en-US"/>
-        </w:rPr>
-      </w:pPr>
-    </w:p>
-    <w:p>
-      <w:pPr>
-        <w:rPr>
-          <w:lang w:val="en-US"/>
-        </w:rPr>
-      </w:pPr>
     </w:p>
     <w:p>
       <w:pPr>
@@ -4952,16 +5017,16 @@
               <w:rPr>
                 <w:sz w:val="22"/>
                 <w:szCs w:val="22"/>
-                <w:lang w:val="en-US"/>
-              </w:rPr>
-            </w:pPr>
-            <w:r>
-              <w:rPr>
-                <w:sz w:val="22"/>
-                <w:szCs w:val="22"/>
-                <w:lang w:val="en-US"/>
-              </w:rPr>
-              <w:t>0.01708488188749001</w:t>
+                <w:lang w:val="en-IL"/>
+              </w:rPr>
+            </w:pPr>
+            <w:r>
+              <w:rPr>
+                <w:sz w:val="22"/>
+                <w:szCs w:val="22"/>
+                <w:lang w:val="en-IL"/>
+              </w:rPr>
+              <w:t>0.02384382946755397</w:t>
             </w:r>
           </w:p>
         </w:tc>
@@ -4975,16 +5040,16 @@
               <w:rPr>
                 <w:sz w:val="22"/>
                 <w:szCs w:val="22"/>
-                <w:lang w:val="en-US"/>
-              </w:rPr>
-            </w:pPr>
-            <w:r>
-              <w:rPr>
-                <w:sz w:val="22"/>
-                <w:szCs w:val="22"/>
-                <w:lang w:val="en-US"/>
-              </w:rPr>
-              <w:t>0.01841226323567999</w:t>
+                <w:lang w:val="en-IL"/>
+              </w:rPr>
+            </w:pPr>
+            <w:r>
+              <w:rPr>
+                <w:sz w:val="22"/>
+                <w:szCs w:val="22"/>
+                <w:lang w:val="en-IL"/>
+              </w:rPr>
+              <w:t>0.024509419331913352</w:t>
             </w:r>
           </w:p>
         </w:tc>
@@ -5139,6 +5204,7 @@
       </w:pPr>
       <w:r>
         <w:rPr>
+          <w:noProof/>
           <w:lang w:val="en-US"/>
         </w:rPr>
         <w:drawing>
@@ -5278,7 +5344,7 @@
       <w:tr>
         <w:tc>
           <w:tcPr>
-            <w:tcW w:w="2402" w:type="dxa"/>
+            <w:tcW w:w="2356" w:type="dxa"/>
             <w:shd w:val="clear" w:color="auto" w:fill="4C94D8" w:themeFill="text2" w:themeFillTint="80"/>
           </w:tcPr>
           <w:p>
@@ -5304,7 +5370,7 @@
         </w:tc>
         <w:tc>
           <w:tcPr>
-            <w:tcW w:w="1562" w:type="dxa"/>
+            <w:tcW w:w="1539" w:type="dxa"/>
             <w:shd w:val="clear" w:color="auto" w:fill="4C94D8" w:themeFill="text2" w:themeFillTint="80"/>
           </w:tcPr>
           <w:p>
@@ -5330,7 +5396,7 @@
         </w:tc>
         <w:tc>
           <w:tcPr>
-            <w:tcW w:w="2552" w:type="dxa"/>
+            <w:tcW w:w="2630" w:type="dxa"/>
             <w:shd w:val="clear" w:color="auto" w:fill="4C94D8" w:themeFill="text2" w:themeFillTint="80"/>
           </w:tcPr>
           <w:p>
@@ -5356,7 +5422,7 @@
         </w:tc>
         <w:tc>
           <w:tcPr>
-            <w:tcW w:w="2834" w:type="dxa"/>
+            <w:tcW w:w="2825" w:type="dxa"/>
             <w:shd w:val="clear" w:color="auto" w:fill="4C94D8" w:themeFill="text2" w:themeFillTint="80"/>
           </w:tcPr>
           <w:p>
@@ -5384,7 +5450,7 @@
       <w:tr>
         <w:tc>
           <w:tcPr>
-            <w:tcW w:w="2402" w:type="dxa"/>
+            <w:tcW w:w="2356" w:type="dxa"/>
             <w:shd w:val="clear" w:color="auto" w:fill="DAE9F7" w:themeFill="text2" w:themeFillTint="1A"/>
           </w:tcPr>
           <w:p>
@@ -5398,7 +5464,7 @@
         </w:tc>
         <w:tc>
           <w:tcPr>
-            <w:tcW w:w="1562" w:type="dxa"/>
+            <w:tcW w:w="1539" w:type="dxa"/>
             <w:shd w:val="clear" w:color="auto" w:fill="DAE9F7" w:themeFill="text2" w:themeFillTint="1A"/>
           </w:tcPr>
           <w:p>
@@ -5412,7 +5478,7 @@
         </w:tc>
         <w:tc>
           <w:tcPr>
-            <w:tcW w:w="5386" w:type="dxa"/>
+            <w:tcW w:w="5455" w:type="dxa"/>
             <w:gridSpan w:val="2"/>
             <w:shd w:val="clear" w:color="auto" w:fill="DAE9F7" w:themeFill="text2" w:themeFillTint="1A"/>
           </w:tcPr>
@@ -5435,7 +5501,7 @@
       <w:tr>
         <w:tc>
           <w:tcPr>
-            <w:tcW w:w="2402" w:type="dxa"/>
+            <w:tcW w:w="2356" w:type="dxa"/>
           </w:tcPr>
           <w:p>
             <w:pPr>
@@ -5454,7 +5520,7 @@
         </w:tc>
         <w:tc>
           <w:tcPr>
-            <w:tcW w:w="1562" w:type="dxa"/>
+            <w:tcW w:w="1539" w:type="dxa"/>
           </w:tcPr>
           <w:p>
             <w:pPr>
@@ -5473,7 +5539,7 @@
         </w:tc>
         <w:tc>
           <w:tcPr>
-            <w:tcW w:w="2552" w:type="dxa"/>
+            <w:tcW w:w="2630" w:type="dxa"/>
           </w:tcPr>
           <w:p>
             <w:pPr>
@@ -5496,7 +5562,7 @@
         </w:tc>
         <w:tc>
           <w:tcPr>
-            <w:tcW w:w="2834" w:type="dxa"/>
+            <w:tcW w:w="2825" w:type="dxa"/>
           </w:tcPr>
           <w:p>
             <w:pPr>
@@ -5521,7 +5587,7 @@
       <w:tr>
         <w:tc>
           <w:tcPr>
-            <w:tcW w:w="2402" w:type="dxa"/>
+            <w:tcW w:w="2356" w:type="dxa"/>
           </w:tcPr>
           <w:p>
             <w:pPr>
@@ -5540,7 +5606,7 @@
         </w:tc>
         <w:tc>
           <w:tcPr>
-            <w:tcW w:w="1562" w:type="dxa"/>
+            <w:tcW w:w="1539" w:type="dxa"/>
           </w:tcPr>
           <w:p>
             <w:pPr>
@@ -5559,7 +5625,7 @@
         </w:tc>
         <w:tc>
           <w:tcPr>
-            <w:tcW w:w="2552" w:type="dxa"/>
+            <w:tcW w:w="2630" w:type="dxa"/>
           </w:tcPr>
           <w:p>
             <w:pPr>
@@ -5582,7 +5648,7 @@
         </w:tc>
         <w:tc>
           <w:tcPr>
-            <w:tcW w:w="2834" w:type="dxa"/>
+            <w:tcW w:w="2825" w:type="dxa"/>
           </w:tcPr>
           <w:p>
             <w:pPr>
@@ -5607,7 +5673,7 @@
       <w:tr>
         <w:tc>
           <w:tcPr>
-            <w:tcW w:w="2402" w:type="dxa"/>
+            <w:tcW w:w="2356" w:type="dxa"/>
           </w:tcPr>
           <w:p>
             <w:pPr>
@@ -5626,7 +5692,7 @@
         </w:tc>
         <w:tc>
           <w:tcPr>
-            <w:tcW w:w="1562" w:type="dxa"/>
+            <w:tcW w:w="1539" w:type="dxa"/>
           </w:tcPr>
           <w:p>
             <w:pPr>
@@ -5645,7 +5711,7 @@
         </w:tc>
         <w:tc>
           <w:tcPr>
-            <w:tcW w:w="2552" w:type="dxa"/>
+            <w:tcW w:w="2630" w:type="dxa"/>
           </w:tcPr>
           <w:p>
             <w:pPr>
@@ -5668,7 +5734,7 @@
         </w:tc>
         <w:tc>
           <w:tcPr>
-            <w:tcW w:w="2834" w:type="dxa"/>
+            <w:tcW w:w="2825" w:type="dxa"/>
           </w:tcPr>
           <w:p>
             <w:pPr>
@@ -5693,7 +5759,7 @@
       <w:tr>
         <w:tc>
           <w:tcPr>
-            <w:tcW w:w="2402" w:type="dxa"/>
+            <w:tcW w:w="2356" w:type="dxa"/>
           </w:tcPr>
           <w:p>
             <w:pPr>
@@ -5712,7 +5778,7 @@
         </w:tc>
         <w:tc>
           <w:tcPr>
-            <w:tcW w:w="1562" w:type="dxa"/>
+            <w:tcW w:w="1539" w:type="dxa"/>
           </w:tcPr>
           <w:p>
             <w:pPr>
@@ -5731,47 +5797,47 @@
         </w:tc>
         <w:tc>
           <w:tcPr>
-            <w:tcW w:w="2552" w:type="dxa"/>
-          </w:tcPr>
-          <w:p>
-            <w:pPr>
-              <w:jc w:val="center"/>
-              <w:rPr>
-                <w:sz w:val="22"/>
-                <w:szCs w:val="22"/>
-                <w:lang w:val="en-US"/>
-              </w:rPr>
-            </w:pPr>
-            <w:r>
-              <w:rPr>
-                <w:sz w:val="22"/>
-                <w:szCs w:val="22"/>
-                <w:lang w:val="en-US"/>
-              </w:rPr>
-              <w:t>0.01708488188749001</w:t>
-            </w:r>
-          </w:p>
-        </w:tc>
-        <w:tc>
-          <w:tcPr>
-            <w:tcW w:w="2834" w:type="dxa"/>
-          </w:tcPr>
-          <w:p>
-            <w:pPr>
-              <w:jc w:val="center"/>
-              <w:rPr>
-                <w:sz w:val="22"/>
-                <w:szCs w:val="22"/>
-                <w:lang w:val="en-US"/>
-              </w:rPr>
-            </w:pPr>
-            <w:r>
-              <w:rPr>
-                <w:sz w:val="22"/>
-                <w:szCs w:val="22"/>
-                <w:lang w:val="en-US"/>
-              </w:rPr>
-              <w:t>0.01841226323567999</w:t>
+            <w:tcW w:w="2630" w:type="dxa"/>
+          </w:tcPr>
+          <w:p>
+            <w:pPr>
+              <w:jc w:val="center"/>
+              <w:rPr>
+                <w:sz w:val="22"/>
+                <w:szCs w:val="22"/>
+                <w:lang w:val="en-US"/>
+              </w:rPr>
+            </w:pPr>
+            <w:r>
+              <w:rPr>
+                <w:sz w:val="22"/>
+                <w:szCs w:val="22"/>
+                <w:lang w:val="en-IL"/>
+              </w:rPr>
+              <w:t>0.02384382946755397</w:t>
+            </w:r>
+          </w:p>
+        </w:tc>
+        <w:tc>
+          <w:tcPr>
+            <w:tcW w:w="2825" w:type="dxa"/>
+          </w:tcPr>
+          <w:p>
+            <w:pPr>
+              <w:jc w:val="center"/>
+              <w:rPr>
+                <w:sz w:val="22"/>
+                <w:szCs w:val="22"/>
+                <w:lang w:val="en-US"/>
+              </w:rPr>
+            </w:pPr>
+            <w:r>
+              <w:rPr>
+                <w:sz w:val="22"/>
+                <w:szCs w:val="22"/>
+                <w:lang w:val="en-IL"/>
+              </w:rPr>
+              <w:t>0.024509419331913352</w:t>
             </w:r>
           </w:p>
         </w:tc>
@@ -5779,7 +5845,7 @@
       <w:tr>
         <w:tc>
           <w:tcPr>
-            <w:tcW w:w="2402" w:type="dxa"/>
+            <w:tcW w:w="2356" w:type="dxa"/>
           </w:tcPr>
           <w:p>
             <w:pPr>
@@ -5798,7 +5864,7 @@
         </w:tc>
         <w:tc>
           <w:tcPr>
-            <w:tcW w:w="1562" w:type="dxa"/>
+            <w:tcW w:w="1539" w:type="dxa"/>
           </w:tcPr>
           <w:p>
             <w:pPr>
@@ -5817,7 +5883,7 @@
         </w:tc>
         <w:tc>
           <w:tcPr>
-            <w:tcW w:w="2552" w:type="dxa"/>
+            <w:tcW w:w="2630" w:type="dxa"/>
           </w:tcPr>
           <w:p>
             <w:pPr>
@@ -5840,7 +5906,7 @@
         </w:tc>
         <w:tc>
           <w:tcPr>
-            <w:tcW w:w="2834" w:type="dxa"/>
+            <w:tcW w:w="2825" w:type="dxa"/>
           </w:tcPr>
           <w:p>
             <w:pPr>
@@ -6666,9 +6732,9 @@
               <w:rPr>
                 <w:sz w:val="22"/>
                 <w:szCs w:val="22"/>
-                <w:lang w:val="en-US"/>
-              </w:rPr>
-              <w:t>0.01708488188749001</w:t>
+                <w:lang w:val="en-IL"/>
+              </w:rPr>
+              <w:t>0.02384382946755397</w:t>
             </w:r>
           </w:p>
         </w:tc>
@@ -6689,9 +6755,9 @@
               <w:rPr>
                 <w:sz w:val="22"/>
                 <w:szCs w:val="22"/>
-                <w:lang w:val="en-US"/>
-              </w:rPr>
-              <w:t>0.01841226323567999</w:t>
+                <w:lang w:val="en-IL"/>
+              </w:rPr>
+              <w:t>0.024509419331913352</w:t>
             </w:r>
           </w:p>
         </w:tc>
@@ -6861,23 +6927,7 @@
           <w:color w:val="215E99" w:themeColor="text2" w:themeTint="BF"/>
           <w:lang w:val="en-US"/>
         </w:rPr>
-        <w:t xml:space="preserve">The model that performed best on the test set is the GBM Regressor model with </w:t>
-      </w:r>
-      <w:proofErr w:type="gramStart"/>
-      <w:r>
-        <w:rPr>
-          <w:color w:val="215E99" w:themeColor="text2" w:themeTint="BF"/>
-          <w:lang w:val="en-US"/>
-        </w:rPr>
-        <w:t>loss</w:t>
-      </w:r>
-      <w:proofErr w:type="gramEnd"/>
-      <w:r>
-        <w:rPr>
-          <w:color w:val="215E99" w:themeColor="text2" w:themeTint="BF"/>
-          <w:lang w:val="en-US"/>
-        </w:rPr>
-        <w:t xml:space="preserve"> of 0.00099.</w:t>
+        <w:t>The model that performed best on the test set is the GBM Regressor model with loss of 0.00099.</w:t>
       </w:r>
     </w:p>
     <w:p>
@@ -6905,14 +6955,12 @@
         </w:rPr>
         <w:t xml:space="preserve">has the worst performance of all the 5 models. It </w:t>
       </w:r>
-      <w:proofErr w:type="gramStart"/>
       <w:r>
         <w:rPr>
           <w:color w:val="215E99" w:themeColor="text2" w:themeTint="BF"/>
         </w:rPr>
         <w:t>underfits</w:t>
       </w:r>
-      <w:proofErr w:type="gramEnd"/>
       <w:r>
         <w:rPr>
           <w:color w:val="215E99" w:themeColor="text2" w:themeTint="BF"/>
@@ -6999,14 +7047,12 @@
         </w:rPr>
         <w:t xml:space="preserve">The </w:t>
       </w:r>
-      <w:proofErr w:type="spellStart"/>
       <w:r>
         <w:rPr>
           <w:color w:val="215E99" w:themeColor="text2" w:themeTint="BF"/>
         </w:rPr>
-        <w:t>Polinomial</w:t>
-      </w:r>
-      <w:proofErr w:type="spellEnd"/>
+        <w:t>Polynomial</w:t>
+      </w:r>
       <w:r>
         <w:rPr>
           <w:color w:val="215E99" w:themeColor="text2" w:themeTint="BF"/>
@@ -7145,6 +7191,78 @@
           <w:lang w:val="en-US"/>
         </w:rPr>
         <w:t xml:space="preserve"> and test accuracies are good and similar.</w:t>
+      </w:r>
+    </w:p>
+    <w:p>
+      <w:pPr>
+        <w:pStyle w:val="ListParagraph"/>
+        <w:numPr>
+          <w:ilvl w:val="0"/>
+          <w:numId w:val="1"/>
+        </w:numPr>
+        <w:rPr>
+          <w:color w:val="215E99" w:themeColor="text2" w:themeTint="BF"/>
+          <w:lang w:val="en-US"/>
+        </w:rPr>
+      </w:pPr>
+      <w:r>
+        <w:rPr>
+          <w:color w:val="215E99" w:themeColor="text2" w:themeTint="BF"/>
+          <w:lang w:val="en-US"/>
+        </w:rPr>
+        <w:t>See attached Histogram below:</w:t>
+      </w:r>
+    </w:p>
+    <w:p>
+      <w:pPr>
+        <w:pStyle w:val="ListParagraph"/>
+        <w:rPr>
+          <w:color w:val="215E99" w:themeColor="text2" w:themeTint="BF"/>
+          <w:lang w:val="en-US"/>
+        </w:rPr>
+      </w:pPr>
+      <w:r>
+        <w:rPr>
+          <w:noProof/>
+          <w:color w:val="215E99" w:themeColor="text2" w:themeTint="BF"/>
+          <w:lang w:val="en-US"/>
+        </w:rPr>
+        <w:lastRenderedPageBreak/>
+        <w:drawing>
+          <wp:inline distT="0" distB="0" distL="0" distR="0" wp14:anchorId="1EA23337" wp14:editId="131DB78E">
+            <wp:extent cx="5135880" cy="3887576"/>
+            <wp:effectExtent l="0" t="0" r="7620" b="0"/>
+            <wp:docPr id="1945335068" name="Picture 1"/>
+            <wp:cNvGraphicFramePr>
+              <a:graphicFrameLocks xmlns:a="http://schemas.openxmlformats.org/drawingml/2006/main" noChangeAspect="1"/>
+            </wp:cNvGraphicFramePr>
+            <a:graphic xmlns:a="http://schemas.openxmlformats.org/drawingml/2006/main">
+              <a:graphicData uri="http://schemas.openxmlformats.org/drawingml/2006/picture">
+                <pic:pic xmlns:pic="http://schemas.openxmlformats.org/drawingml/2006/picture">
+                  <pic:nvPicPr>
+                    <pic:cNvPr id="1945335068" name=""/>
+                    <pic:cNvPicPr/>
+                  </pic:nvPicPr>
+                  <pic:blipFill>
+                    <a:blip r:embed="rId39"/>
+                    <a:stretch>
+                      <a:fillRect/>
+                    </a:stretch>
+                  </pic:blipFill>
+                  <pic:spPr>
+                    <a:xfrm>
+                      <a:off x="0" y="0"/>
+                      <a:ext cx="5139944" cy="3890652"/>
+                    </a:xfrm>
+                    <a:prstGeom prst="rect">
+                      <a:avLst/>
+                    </a:prstGeom>
+                  </pic:spPr>
+                </pic:pic>
+              </a:graphicData>
+            </a:graphic>
+          </wp:inline>
+        </w:drawing>
       </w:r>
     </w:p>
     <w:sectPr>

</xml_diff>